<commit_message>
docs: roadmap v0.4 - Keycloak cut-over in Sprint 4, Sprint 0 progress
Co-Authored-By: Claude Opus 5.5 <noreply@anthropic.com>
Claude-Session: https://claude.ai/code/session_01PnPKkUJ7kkEgn6cEybQVif
</commit_message>
<xml_diff>
--- a/docs/Nex_Architecture_and_Roadmap.docx
+++ b/docs/Nex_Architecture_and_Roadmap.docx
@@ -90,7 +90,7 @@
           <w:sz w:val="20"/>
           <w:szCs w:val="20"/>
         </w:rPr>
-        <w:t xml:space="preserve">v0.3 (24 Sep 2026). Replaces v0.2, which was based on the wrong repository</w:t>
+        <w:t xml:space="preserve">v0.4 (11 Oct 2026): Keycloak cut-over moved to Sprint 4; Sprint 0 progress recorded. v0.3 (24 Sep 2026) replaced v0.2, which was based on the wrong repository</w:t>
       </w:r>
     </w:p>
     <w:p>
@@ -107,7 +107,7 @@
         </w:rPr>
         <w:t xml:space="preserve">Codebase:  </w:t>
       </w:r>
-      <w:hyperlink w:history="1" r:id="rId6lxps8puu_1kfs3yjd_ui">
+      <w:hyperlink w:history="1" r:id="rIdzma6ckndo1ix3vteyxgy6">
         <w:r>
           <w:rPr>
             <w:rFonts w:ascii="Consolas" w:cs="Consolas" w:eastAsia="Consolas" w:hAnsi="Consolas"/>
@@ -302,7 +302,7 @@
           <w:sz w:val="20"/>
           <w:szCs w:val="20"/>
         </w:rPr>
-        <w:t xml:space="preserve">Version 0.3 — 24 September 2026</w:t>
+        <w:t xml:space="preserve">Version 0.4 — 11 October 2026</w:t>
       </w:r>
     </w:p>
     <w:p>
@@ -366,7 +366,756 @@
         <w:pStyle w:val="Heading1"/>
       </w:pPr>
       <w:r>
-        <w:t xml:space="preserve">0. What changed in v0.3</w:t>
+        <w:t xml:space="preserve">0. What changed in v0.4 (11 Oct 2026)</w:t>
+      </w:r>
+    </w:p>
+    <w:tbl>
+      <w:tblPr>
+        <w:tblW w:type="dxa" w:w="9638"/>
+        <w:tblBorders>
+          <w:top w:val="single" w:color="auto" w:sz="4"/>
+          <w:left w:val="single" w:color="auto" w:sz="4"/>
+          <w:bottom w:val="single" w:color="auto" w:sz="4"/>
+          <w:right w:val="single" w:color="auto" w:sz="4"/>
+          <w:insideH w:val="single" w:color="auto" w:sz="4"/>
+          <w:insideV w:val="single" w:color="auto" w:sz="4"/>
+        </w:tblBorders>
+        <w:tblLayout w:type="fixed"/>
+      </w:tblPr>
+      <w:tblGrid>
+        <w:gridCol w:w="1599"/>
+        <w:gridCol w:w="1615"/>
+        <w:gridCol w:w="6424"/>
+      </w:tblGrid>
+      <w:tr>
+        <w:trPr>
+          <w:cantSplit/>
+          <w:tblHeader/>
+        </w:trPr>
+        <w:tc>
+          <w:tcPr>
+            <w:tcW w:type="dxa" w:w="1599"/>
+            <w:tcBorders>
+              <w:top w:val="single" w:color="B7C3D3" w:sz="4"/>
+              <w:left w:val="single" w:color="B7C3D3" w:sz="4"/>
+              <w:bottom w:val="single" w:color="B7C3D3" w:sz="4"/>
+              <w:right w:val="single" w:color="B7C3D3" w:sz="4"/>
+            </w:tcBorders>
+            <w:shd w:fill="1F3A5F" w:color="auto" w:val="clear"/>
+            <w:tcMar>
+              <w:top w:type="dxa" w:w="60"/>
+              <w:left w:type="dxa" w:w="100"/>
+              <w:bottom w:type="dxa" w:w="60"/>
+              <w:right w:type="dxa" w:w="100"/>
+            </w:tcMar>
+          </w:tcPr>
+          <w:p>
+            <w:pPr>
+              <w:spacing w:after="0" w:before="0"/>
+              <w:jc w:val="left"/>
+            </w:pPr>
+            <w:r>
+              <w:rPr>
+                <w:b/>
+                <w:bCs/>
+                <w:color w:val="FFFFFF"/>
+                <w:sz w:val="18"/>
+                <w:szCs w:val="18"/>
+              </w:rPr>
+              <w:t xml:space="preserve">Topic</w:t>
+            </w:r>
+          </w:p>
+        </w:tc>
+        <w:tc>
+          <w:tcPr>
+            <w:tcW w:type="dxa" w:w="1615"/>
+            <w:tcBorders>
+              <w:top w:val="single" w:color="B7C3D3" w:sz="4"/>
+              <w:left w:val="single" w:color="B7C3D3" w:sz="4"/>
+              <w:bottom w:val="single" w:color="B7C3D3" w:sz="4"/>
+              <w:right w:val="single" w:color="B7C3D3" w:sz="4"/>
+            </w:tcBorders>
+            <w:shd w:fill="1F3A5F" w:color="auto" w:val="clear"/>
+            <w:tcMar>
+              <w:top w:type="dxa" w:w="60"/>
+              <w:left w:type="dxa" w:w="100"/>
+              <w:bottom w:type="dxa" w:w="60"/>
+              <w:right w:type="dxa" w:w="100"/>
+            </w:tcMar>
+          </w:tcPr>
+          <w:p>
+            <w:pPr>
+              <w:spacing w:after="0" w:before="0"/>
+              <w:jc w:val="left"/>
+            </w:pPr>
+            <w:r>
+              <w:rPr>
+                <w:b/>
+                <w:bCs/>
+                <w:color w:val="FFFFFF"/>
+                <w:sz w:val="18"/>
+                <w:szCs w:val="18"/>
+              </w:rPr>
+              <w:t xml:space="preserve">v0.3</w:t>
+            </w:r>
+          </w:p>
+        </w:tc>
+        <w:tc>
+          <w:tcPr>
+            <w:tcW w:type="dxa" w:w="6424"/>
+            <w:tcBorders>
+              <w:top w:val="single" w:color="B7C3D3" w:sz="4"/>
+              <w:left w:val="single" w:color="B7C3D3" w:sz="4"/>
+              <w:bottom w:val="single" w:color="B7C3D3" w:sz="4"/>
+              <w:right w:val="single" w:color="B7C3D3" w:sz="4"/>
+            </w:tcBorders>
+            <w:shd w:fill="1F3A5F" w:color="auto" w:val="clear"/>
+            <w:tcMar>
+              <w:top w:type="dxa" w:w="60"/>
+              <w:left w:type="dxa" w:w="100"/>
+              <w:bottom w:type="dxa" w:w="60"/>
+              <w:right w:type="dxa" w:w="100"/>
+            </w:tcMar>
+          </w:tcPr>
+          <w:p>
+            <w:pPr>
+              <w:spacing w:after="0" w:before="0"/>
+              <w:jc w:val="left"/>
+            </w:pPr>
+            <w:r>
+              <w:rPr>
+                <w:b/>
+                <w:bCs/>
+                <w:color w:val="FFFFFF"/>
+                <w:sz w:val="18"/>
+                <w:szCs w:val="18"/>
+              </w:rPr>
+              <w:t xml:space="preserve">v0.4</w:t>
+            </w:r>
+          </w:p>
+        </w:tc>
+      </w:tr>
+      <w:tr>
+        <w:trPr>
+          <w:cantSplit/>
+        </w:trPr>
+        <w:tc>
+          <w:tcPr>
+            <w:tcW w:type="dxa" w:w="1599"/>
+            <w:tcBorders>
+              <w:top w:val="single" w:color="B7C3D3" w:sz="4"/>
+              <w:left w:val="single" w:color="B7C3D3" w:sz="4"/>
+              <w:bottom w:val="single" w:color="B7C3D3" w:sz="4"/>
+              <w:right w:val="single" w:color="B7C3D3" w:sz="4"/>
+            </w:tcBorders>
+            <w:tcMar>
+              <w:top w:type="dxa" w:w="60"/>
+              <w:left w:type="dxa" w:w="100"/>
+              <w:bottom w:type="dxa" w:w="60"/>
+              <w:right w:type="dxa" w:w="100"/>
+            </w:tcMar>
+          </w:tcPr>
+          <w:p>
+            <w:pPr>
+              <w:spacing w:after="0" w:before="0"/>
+              <w:jc w:val="left"/>
+            </w:pPr>
+            <w:r>
+              <w:rPr>
+                <w:sz w:val="18"/>
+                <w:szCs w:val="18"/>
+              </w:rPr>
+              <w:t xml:space="preserve">Keycloak cut-over</w:t>
+            </w:r>
+          </w:p>
+        </w:tc>
+        <w:tc>
+          <w:tcPr>
+            <w:tcW w:type="dxa" w:w="1615"/>
+            <w:tcBorders>
+              <w:top w:val="single" w:color="B7C3D3" w:sz="4"/>
+              <w:left w:val="single" w:color="B7C3D3" w:sz="4"/>
+              <w:bottom w:val="single" w:color="B7C3D3" w:sz="4"/>
+              <w:right w:val="single" w:color="B7C3D3" w:sz="4"/>
+            </w:tcBorders>
+            <w:tcMar>
+              <w:top w:type="dxa" w:w="60"/>
+              <w:left w:type="dxa" w:w="100"/>
+              <w:bottom w:type="dxa" w:w="60"/>
+              <w:right w:type="dxa" w:w="100"/>
+            </w:tcMar>
+          </w:tcPr>
+          <w:p>
+            <w:pPr>
+              <w:spacing w:after="0" w:before="0"/>
+              <w:jc w:val="left"/>
+            </w:pPr>
+            <w:r>
+              <w:rPr>
+                <w:sz w:val="18"/>
+                <w:szCs w:val="18"/>
+              </w:rPr>
+              <w:t xml:space="preserve">Sprint 1</w:t>
+            </w:r>
+          </w:p>
+        </w:tc>
+        <w:tc>
+          <w:tcPr>
+            <w:tcW w:type="dxa" w:w="6424"/>
+            <w:tcBorders>
+              <w:top w:val="single" w:color="B7C3D3" w:sz="4"/>
+              <w:left w:val="single" w:color="B7C3D3" w:sz="4"/>
+              <w:bottom w:val="single" w:color="B7C3D3" w:sz="4"/>
+              <w:right w:val="single" w:color="B7C3D3" w:sz="4"/>
+            </w:tcBorders>
+            <w:tcMar>
+              <w:top w:type="dxa" w:w="60"/>
+              <w:left w:type="dxa" w:w="100"/>
+              <w:bottom w:type="dxa" w:w="60"/>
+              <w:right w:type="dxa" w:w="100"/>
+            </w:tcMar>
+          </w:tcPr>
+          <w:p>
+            <w:pPr>
+              <w:spacing w:after="0" w:before="0"/>
+              <w:jc w:val="left"/>
+            </w:pPr>
+            <w:r>
+              <w:rPr>
+                <w:b/>
+                <w:bCs/>
+                <w:sz w:val="18"/>
+                <w:szCs w:val="18"/>
+              </w:rPr>
+              <w:t xml:space="preserve">Sprint 4 (23 Nov – 4 Dec)</w:t>
+            </w:r>
+            <w:r>
+              <w:rPr>
+                <w:sz w:val="18"/>
+                <w:szCs w:val="18"/>
+              </w:rPr>
+              <w:t xml:space="preserve">, so that testing during S1–S3 is not slowed down by real logins. It must be live before the pilot holds client data (11 Jan)</w:t>
+            </w:r>
+          </w:p>
+        </w:tc>
+      </w:tr>
+      <w:tr>
+        <w:trPr>
+          <w:cantSplit/>
+        </w:trPr>
+        <w:tc>
+          <w:tcPr>
+            <w:tcW w:type="dxa" w:w="1599"/>
+            <w:tcBorders>
+              <w:top w:val="single" w:color="B7C3D3" w:sz="4"/>
+              <w:left w:val="single" w:color="B7C3D3" w:sz="4"/>
+              <w:bottom w:val="single" w:color="B7C3D3" w:sz="4"/>
+              <w:right w:val="single" w:color="B7C3D3" w:sz="4"/>
+            </w:tcBorders>
+            <w:shd w:fill="F3F6FA" w:color="auto" w:val="clear"/>
+            <w:tcMar>
+              <w:top w:type="dxa" w:w="60"/>
+              <w:left w:type="dxa" w:w="100"/>
+              <w:bottom w:type="dxa" w:w="60"/>
+              <w:right w:type="dxa" w:w="100"/>
+            </w:tcMar>
+          </w:tcPr>
+          <w:p>
+            <w:pPr>
+              <w:spacing w:after="0" w:before="0"/>
+              <w:jc w:val="left"/>
+            </w:pPr>
+            <w:r>
+              <w:rPr>
+                <w:sz w:val="18"/>
+                <w:szCs w:val="18"/>
+              </w:rPr>
+              <w:t xml:space="preserve">How the cut-over happens</w:t>
+            </w:r>
+          </w:p>
+        </w:tc>
+        <w:tc>
+          <w:tcPr>
+            <w:tcW w:type="dxa" w:w="1615"/>
+            <w:tcBorders>
+              <w:top w:val="single" w:color="B7C3D3" w:sz="4"/>
+              <w:left w:val="single" w:color="B7C3D3" w:sz="4"/>
+              <w:bottom w:val="single" w:color="B7C3D3" w:sz="4"/>
+              <w:right w:val="single" w:color="B7C3D3" w:sz="4"/>
+            </w:tcBorders>
+            <w:shd w:fill="F3F6FA" w:color="auto" w:val="clear"/>
+            <w:tcMar>
+              <w:top w:type="dxa" w:w="60"/>
+              <w:left w:type="dxa" w:w="100"/>
+              <w:bottom w:type="dxa" w:w="60"/>
+              <w:right w:type="dxa" w:w="100"/>
+            </w:tcMar>
+          </w:tcPr>
+          <w:p>
+            <w:pPr>
+              <w:spacing w:after="0" w:before="0"/>
+              <w:jc w:val="left"/>
+            </w:pPr>
+            <w:r>
+              <w:rPr>
+                <w:sz w:val="18"/>
+                <w:szCs w:val="18"/>
+              </w:rPr>
+              <w:t xml:space="preserve">Remove the bypass in code</w:t>
+            </w:r>
+          </w:p>
+        </w:tc>
+        <w:tc>
+          <w:tcPr>
+            <w:tcW w:type="dxa" w:w="6424"/>
+            <w:tcBorders>
+              <w:top w:val="single" w:color="B7C3D3" w:sz="4"/>
+              <w:left w:val="single" w:color="B7C3D3" w:sz="4"/>
+              <w:bottom w:val="single" w:color="B7C3D3" w:sz="4"/>
+              <w:right w:val="single" w:color="B7C3D3" w:sz="4"/>
+            </w:tcBorders>
+            <w:shd w:fill="F3F6FA" w:color="auto" w:val="clear"/>
+            <w:tcMar>
+              <w:top w:type="dxa" w:w="60"/>
+              <w:left w:type="dxa" w:w="100"/>
+              <w:bottom w:type="dxa" w:w="60"/>
+              <w:right w:type="dxa" w:w="100"/>
+            </w:tcMar>
+          </w:tcPr>
+          <w:p>
+            <w:pPr>
+              <w:spacing w:after="0" w:before="0"/>
+              <w:jc w:val="left"/>
+            </w:pPr>
+            <w:r>
+              <w:rPr>
+                <w:sz w:val="18"/>
+                <w:szCs w:val="18"/>
+              </w:rPr>
+              <w:t xml:space="preserve">The bypass is now a </w:t>
+            </w:r>
+            <w:r>
+              <w:rPr>
+                <w:b/>
+                <w:bCs/>
+                <w:sz w:val="18"/>
+                <w:szCs w:val="18"/>
+              </w:rPr>
+              <w:t xml:space="preserve">setting</w:t>
+            </w:r>
+            <w:r>
+              <w:rPr>
+                <w:sz w:val="18"/>
+                <w:szCs w:val="18"/>
+              </w:rPr>
+              <w:t xml:space="preserve"> (</w:t>
+            </w:r>
+            <w:r>
+              <w:rPr>
+                <w:rFonts w:ascii="Consolas" w:cs="Consolas" w:eastAsia="Consolas" w:hAnsi="Consolas"/>
+                <w:sz w:val="16"/>
+                <w:szCs w:val="16"/>
+                <w:shd w:fill="EEF1F5" w:color="auto" w:val="clear"/>
+              </w:rPr>
+              <w:t xml:space="preserve">app.security.auth-bypass</w:t>
+            </w:r>
+            <w:r>
+              <w:rPr>
+                <w:sz w:val="18"/>
+                <w:szCs w:val="18"/>
+              </w:rPr>
+              <w:t xml:space="preserve">, default </w:t>
+            </w:r>
+            <w:r>
+              <w:rPr>
+                <w:rFonts w:ascii="Consolas" w:cs="Consolas" w:eastAsia="Consolas" w:hAnsi="Consolas"/>
+                <w:sz w:val="16"/>
+                <w:szCs w:val="16"/>
+                <w:shd w:fill="EEF1F5" w:color="auto" w:val="clear"/>
+              </w:rPr>
+              <w:t xml:space="preserve">true</w:t>
+            </w:r>
+            <w:r>
+              <w:rPr>
+                <w:sz w:val="18"/>
+                <w:szCs w:val="18"/>
+              </w:rPr>
+              <w:t xml:space="preserve">). The cut-over turns it off per environment: AWS dev first, then pilot. Previews may stay bypassed</w:t>
+            </w:r>
+          </w:p>
+        </w:tc>
+      </w:tr>
+      <w:tr>
+        <w:trPr>
+          <w:cantSplit/>
+        </w:trPr>
+        <w:tc>
+          <w:tcPr>
+            <w:tcW w:type="dxa" w:w="1599"/>
+            <w:tcBorders>
+              <w:top w:val="single" w:color="B7C3D3" w:sz="4"/>
+              <w:left w:val="single" w:color="B7C3D3" w:sz="4"/>
+              <w:bottom w:val="single" w:color="B7C3D3" w:sz="4"/>
+              <w:right w:val="single" w:color="B7C3D3" w:sz="4"/>
+            </w:tcBorders>
+            <w:tcMar>
+              <w:top w:type="dxa" w:w="60"/>
+              <w:left w:type="dxa" w:w="100"/>
+              <w:bottom w:type="dxa" w:w="60"/>
+              <w:right w:type="dxa" w:w="100"/>
+            </w:tcMar>
+          </w:tcPr>
+          <w:p>
+            <w:pPr>
+              <w:spacing w:after="0" w:before="0"/>
+              <w:jc w:val="left"/>
+            </w:pPr>
+            <w:r>
+              <w:rPr>
+                <w:sz w:val="18"/>
+                <w:szCs w:val="18"/>
+              </w:rPr>
+              <w:t xml:space="preserve">Production demo users</w:t>
+            </w:r>
+          </w:p>
+        </w:tc>
+        <w:tc>
+          <w:tcPr>
+            <w:tcW w:type="dxa" w:w="1615"/>
+            <w:tcBorders>
+              <w:top w:val="single" w:color="B7C3D3" w:sz="4"/>
+              <w:left w:val="single" w:color="B7C3D3" w:sz="4"/>
+              <w:bottom w:val="single" w:color="B7C3D3" w:sz="4"/>
+              <w:right w:val="single" w:color="B7C3D3" w:sz="4"/>
+            </w:tcBorders>
+            <w:tcMar>
+              <w:top w:type="dxa" w:w="60"/>
+              <w:left w:type="dxa" w:w="100"/>
+              <w:bottom w:type="dxa" w:w="60"/>
+              <w:right w:type="dxa" w:w="100"/>
+            </w:tcMar>
+          </w:tcPr>
+          <w:p>
+            <w:pPr>
+              <w:spacing w:after="0" w:before="0"/>
+              <w:jc w:val="left"/>
+            </w:pPr>
+            <w:r>
+              <w:rPr>
+                <w:sz w:val="18"/>
+                <w:szCs w:val="18"/>
+              </w:rPr>
+              <w:t xml:space="preserve">Not addressed</w:t>
+            </w:r>
+          </w:p>
+        </w:tc>
+        <w:tc>
+          <w:tcPr>
+            <w:tcW w:type="dxa" w:w="6424"/>
+            <w:tcBorders>
+              <w:top w:val="single" w:color="B7C3D3" w:sz="4"/>
+              <w:left w:val="single" w:color="B7C3D3" w:sz="4"/>
+              <w:bottom w:val="single" w:color="B7C3D3" w:sz="4"/>
+              <w:right w:val="single" w:color="B7C3D3" w:sz="4"/>
+            </w:tcBorders>
+            <w:tcMar>
+              <w:top w:type="dxa" w:w="60"/>
+              <w:left w:type="dxa" w:w="100"/>
+              <w:bottom w:type="dxa" w:w="60"/>
+              <w:right w:type="dxa" w:w="100"/>
+            </w:tcMar>
+          </w:tcPr>
+          <w:p>
+            <w:pPr>
+              <w:spacing w:after="0" w:before="0"/>
+              <w:jc w:val="left"/>
+            </w:pPr>
+            <w:r>
+              <w:rPr>
+                <w:b/>
+                <w:bCs/>
+                <w:sz w:val="18"/>
+                <w:szCs w:val="18"/>
+              </w:rPr>
+              <w:t xml:space="preserve">Fixed now:</w:t>
+            </w:r>
+            <w:r>
+              <w:rPr>
+                <w:sz w:val="18"/>
+                <w:szCs w:val="18"/>
+              </w:rPr>
+              <w:t xml:space="preserve"> production no longer seeds </w:t>
+            </w:r>
+            <w:r>
+              <w:rPr>
+                <w:rFonts w:ascii="Consolas" w:cs="Consolas" w:eastAsia="Consolas" w:hAnsi="Consolas"/>
+                <w:sz w:val="16"/>
+                <w:szCs w:val="16"/>
+                <w:shd w:fill="EEF1F5" w:color="auto" w:val="clear"/>
+              </w:rPr>
+              <w:t xml:space="preserve">trader1</w:t>
+            </w:r>
+            <w:r>
+              <w:rPr>
+                <w:sz w:val="18"/>
+                <w:szCs w:val="18"/>
+              </w:rPr>
+              <w:t xml:space="preserve">/</w:t>
+            </w:r>
+            <w:r>
+              <w:rPr>
+                <w:rFonts w:ascii="Consolas" w:cs="Consolas" w:eastAsia="Consolas" w:hAnsi="Consolas"/>
+                <w:sz w:val="16"/>
+                <w:szCs w:val="16"/>
+                <w:shd w:fill="EEF1F5" w:color="auto" w:val="clear"/>
+              </w:rPr>
+              <w:t xml:space="preserve">trader2</w:t>
+            </w:r>
+            <w:r>
+              <w:rPr>
+                <w:sz w:val="18"/>
+                <w:szCs w:val="18"/>
+              </w:rPr>
+              <w:t xml:space="preserve">/</w:t>
+            </w:r>
+            <w:r>
+              <w:rPr>
+                <w:rFonts w:ascii="Consolas" w:cs="Consolas" w:eastAsia="Consolas" w:hAnsi="Consolas"/>
+                <w:sz w:val="16"/>
+                <w:szCs w:val="16"/>
+                <w:shd w:fill="EEF1F5" w:color="auto" w:val="clear"/>
+              </w:rPr>
+              <w:t xml:space="preserve">admin1</w:t>
+            </w:r>
+            <w:r>
+              <w:rPr>
+                <w:sz w:val="18"/>
+                <w:szCs w:val="18"/>
+              </w:rPr>
+              <w:t xml:space="preserve"> (password = username) and deactivates any that still have the default password; an optional bootstrap admin comes from a secret (#79)</w:t>
+            </w:r>
+          </w:p>
+        </w:tc>
+      </w:tr>
+      <w:tr>
+        <w:trPr>
+          <w:cantSplit/>
+        </w:trPr>
+        <w:tc>
+          <w:tcPr>
+            <w:tcW w:type="dxa" w:w="1599"/>
+            <w:tcBorders>
+              <w:top w:val="single" w:color="B7C3D3" w:sz="4"/>
+              <w:left w:val="single" w:color="B7C3D3" w:sz="4"/>
+              <w:bottom w:val="single" w:color="B7C3D3" w:sz="4"/>
+              <w:right w:val="single" w:color="B7C3D3" w:sz="4"/>
+            </w:tcBorders>
+            <w:shd w:fill="F3F6FA" w:color="auto" w:val="clear"/>
+            <w:tcMar>
+              <w:top w:type="dxa" w:w="60"/>
+              <w:left w:type="dxa" w:w="100"/>
+              <w:bottom w:type="dxa" w:w="60"/>
+              <w:right w:type="dxa" w:w="100"/>
+            </w:tcMar>
+          </w:tcPr>
+          <w:p>
+            <w:pPr>
+              <w:spacing w:after="0" w:before="0"/>
+              <w:jc w:val="left"/>
+            </w:pPr>
+            <w:r>
+              <w:rPr>
+                <w:sz w:val="18"/>
+                <w:szCs w:val="18"/>
+              </w:rPr>
+              <w:t xml:space="preserve">Sprint 1</w:t>
+            </w:r>
+          </w:p>
+        </w:tc>
+        <w:tc>
+          <w:tcPr>
+            <w:tcW w:type="dxa" w:w="1615"/>
+            <w:tcBorders>
+              <w:top w:val="single" w:color="B7C3D3" w:sz="4"/>
+              <w:left w:val="single" w:color="B7C3D3" w:sz="4"/>
+              <w:bottom w:val="single" w:color="B7C3D3" w:sz="4"/>
+              <w:right w:val="single" w:color="B7C3D3" w:sz="4"/>
+            </w:tcBorders>
+            <w:shd w:fill="F3F6FA" w:color="auto" w:val="clear"/>
+            <w:tcMar>
+              <w:top w:type="dxa" w:w="60"/>
+              <w:left w:type="dxa" w:w="100"/>
+              <w:bottom w:type="dxa" w:w="60"/>
+              <w:right w:type="dxa" w:w="100"/>
+            </w:tcMar>
+          </w:tcPr>
+          <w:p>
+            <w:pPr>
+              <w:spacing w:after="0" w:before="0"/>
+              <w:jc w:val="left"/>
+            </w:pPr>
+            <w:r>
+              <w:rPr>
+                <w:sz w:val="18"/>
+                <w:szCs w:val="18"/>
+              </w:rPr>
+              <w:t xml:space="preserve">Auth, state, storage</w:t>
+            </w:r>
+          </w:p>
+        </w:tc>
+        <w:tc>
+          <w:tcPr>
+            <w:tcW w:type="dxa" w:w="6424"/>
+            <w:tcBorders>
+              <w:top w:val="single" w:color="B7C3D3" w:sz="4"/>
+              <w:left w:val="single" w:color="B7C3D3" w:sz="4"/>
+              <w:bottom w:val="single" w:color="B7C3D3" w:sz="4"/>
+              <w:right w:val="single" w:color="B7C3D3" w:sz="4"/>
+            </w:tcBorders>
+            <w:shd w:fill="F3F6FA" w:color="auto" w:val="clear"/>
+            <w:tcMar>
+              <w:top w:type="dxa" w:w="60"/>
+              <w:left w:type="dxa" w:w="100"/>
+              <w:bottom w:type="dxa" w:w="60"/>
+              <w:right w:type="dxa" w:w="100"/>
+            </w:tcMar>
+          </w:tcPr>
+          <w:p>
+            <w:pPr>
+              <w:spacing w:after="0" w:before="0"/>
+              <w:jc w:val="left"/>
+            </w:pPr>
+            <w:r>
+              <w:rPr>
+                <w:b/>
+                <w:bCs/>
+                <w:sz w:val="18"/>
+                <w:szCs w:val="18"/>
+              </w:rPr>
+              <w:t xml:space="preserve">State, storage and scheduling</w:t>
+            </w:r>
+            <w:r>
+              <w:rPr>
+                <w:sz w:val="18"/>
+                <w:szCs w:val="18"/>
+              </w:rPr>
+              <w:t xml:space="preserve"> (Redis job/session state, ShedLock, S3 report storage, trade audit history)</w:t>
+            </w:r>
+          </w:p>
+        </w:tc>
+      </w:tr>
+      <w:tr>
+        <w:trPr>
+          <w:cantSplit/>
+        </w:trPr>
+        <w:tc>
+          <w:tcPr>
+            <w:tcW w:type="dxa" w:w="1599"/>
+            <w:tcBorders>
+              <w:top w:val="single" w:color="B7C3D3" w:sz="4"/>
+              <w:left w:val="single" w:color="B7C3D3" w:sz="4"/>
+              <w:bottom w:val="single" w:color="B7C3D3" w:sz="4"/>
+              <w:right w:val="single" w:color="B7C3D3" w:sz="4"/>
+            </w:tcBorders>
+            <w:tcMar>
+              <w:top w:type="dxa" w:w="60"/>
+              <w:left w:type="dxa" w:w="100"/>
+              <w:bottom w:type="dxa" w:w="60"/>
+              <w:right w:type="dxa" w:w="100"/>
+            </w:tcMar>
+          </w:tcPr>
+          <w:p>
+            <w:pPr>
+              <w:spacing w:after="0" w:before="0"/>
+              <w:jc w:val="left"/>
+            </w:pPr>
+            <w:r>
+              <w:rPr>
+                <w:sz w:val="18"/>
+                <w:szCs w:val="18"/>
+              </w:rPr>
+              <w:t xml:space="preserve">Sprint 0</w:t>
+            </w:r>
+          </w:p>
+        </w:tc>
+        <w:tc>
+          <w:tcPr>
+            <w:tcW w:type="dxa" w:w="1615"/>
+            <w:tcBorders>
+              <w:top w:val="single" w:color="B7C3D3" w:sz="4"/>
+              <w:left w:val="single" w:color="B7C3D3" w:sz="4"/>
+              <w:bottom w:val="single" w:color="B7C3D3" w:sz="4"/>
+              <w:right w:val="single" w:color="B7C3D3" w:sz="4"/>
+            </w:tcBorders>
+            <w:tcMar>
+              <w:top w:type="dxa" w:w="60"/>
+              <w:left w:type="dxa" w:w="100"/>
+              <w:bottom w:type="dxa" w:w="60"/>
+              <w:right w:type="dxa" w:w="100"/>
+            </w:tcMar>
+          </w:tcPr>
+          <w:p>
+            <w:pPr>
+              <w:spacing w:after="0" w:before="0"/>
+              <w:jc w:val="left"/>
+            </w:pPr>
+            <w:r>
+              <w:rPr>
+                <w:sz w:val="18"/>
+                <w:szCs w:val="18"/>
+              </w:rPr>
+              <w:t xml:space="preserve">Planned</w:t>
+            </w:r>
+          </w:p>
+        </w:tc>
+        <w:tc>
+          <w:tcPr>
+            <w:tcW w:type="dxa" w:w="6424"/>
+            <w:tcBorders>
+              <w:top w:val="single" w:color="B7C3D3" w:sz="4"/>
+              <w:left w:val="single" w:color="B7C3D3" w:sz="4"/>
+              <w:bottom w:val="single" w:color="B7C3D3" w:sz="4"/>
+              <w:right w:val="single" w:color="B7C3D3" w:sz="4"/>
+            </w:tcBorders>
+            <w:tcMar>
+              <w:top w:type="dxa" w:w="60"/>
+              <w:left w:type="dxa" w:w="100"/>
+              <w:bottom w:type="dxa" w:w="60"/>
+              <w:right w:type="dxa" w:w="100"/>
+            </w:tcMar>
+          </w:tcPr>
+          <w:p>
+            <w:pPr>
+              <w:spacing w:after="0" w:before="0"/>
+              <w:jc w:val="left"/>
+            </w:pPr>
+            <w:r>
+              <w:rPr>
+                <w:sz w:val="18"/>
+                <w:szCs w:val="18"/>
+              </w:rPr>
+              <w:t xml:space="preserve">Mostly delivered (see §8.0)</w:t>
+            </w:r>
+          </w:p>
+        </w:tc>
+      </w:tr>
+    </w:tbl>
+    <w:p>
+      <w:pPr>
+        <w:spacing w:after="120"/>
+      </w:pPr>
+    </w:p>
+    <w:p>
+      <w:r>
+        <w:br w:type="page"/>
+      </w:r>
+    </w:p>
+    <w:p>
+      <w:pPr>
+        <w:pStyle w:val="Heading1"/>
+      </w:pPr>
+      <w:r>
+        <w:t xml:space="preserve">0.1 What changed in v0.3</w:t>
       </w:r>
     </w:p>
     <w:p>
@@ -1358,7 +2107,7 @@
         <w:spacing w:after="60"/>
       </w:pPr>
       <w:r>
-        <w:t xml:space="preserve">real Keycloak authentication in place of the auth bypass</w:t>
+        <w:t xml:space="preserve">real Keycloak authentication in place of the auth bypass (switched on in S4, via a per-environment setting)</w:t>
       </w:r>
     </w:p>
     <w:p>
@@ -2917,9 +3666,9 @@
       </w:tblPr>
       <w:tblGrid>
         <w:gridCol w:w="996"/>
-        <w:gridCol w:w="1490"/>
-        <w:gridCol w:w="3916"/>
-        <w:gridCol w:w="3236"/>
+        <w:gridCol w:w="1473"/>
+        <w:gridCol w:w="3872"/>
+        <w:gridCol w:w="3297"/>
       </w:tblGrid>
       <w:tr>
         <w:trPr>
@@ -2962,7 +3711,7 @@
         </w:tc>
         <w:tc>
           <w:tcPr>
-            <w:tcW w:type="dxa" w:w="1490"/>
+            <w:tcW w:type="dxa" w:w="1473"/>
             <w:tcBorders>
               <w:top w:val="single" w:color="B7C3D3" w:sz="4"/>
               <w:left w:val="single" w:color="B7C3D3" w:sz="4"/>
@@ -2996,7 +3745,7 @@
         </w:tc>
         <w:tc>
           <w:tcPr>
-            <w:tcW w:type="dxa" w:w="3916"/>
+            <w:tcW w:type="dxa" w:w="3872"/>
             <w:tcBorders>
               <w:top w:val="single" w:color="B7C3D3" w:sz="4"/>
               <w:left w:val="single" w:color="B7C3D3" w:sz="4"/>
@@ -3030,7 +3779,7 @@
         </w:tc>
         <w:tc>
           <w:tcPr>
-            <w:tcW w:type="dxa" w:w="3236"/>
+            <w:tcW w:type="dxa" w:w="3297"/>
             <w:tcBorders>
               <w:top w:val="single" w:color="B7C3D3" w:sz="4"/>
               <w:left w:val="single" w:color="B7C3D3" w:sz="4"/>
@@ -3099,7 +3848,7 @@
         </w:tc>
         <w:tc>
           <w:tcPr>
-            <w:tcW w:type="dxa" w:w="1490"/>
+            <w:tcW w:type="dxa" w:w="1473"/>
             <w:tcBorders>
               <w:top w:val="single" w:color="B7C3D3" w:sz="4"/>
               <w:left w:val="single" w:color="B7C3D3" w:sz="4"/>
@@ -3131,7 +3880,7 @@
         </w:tc>
         <w:tc>
           <w:tcPr>
-            <w:tcW w:type="dxa" w:w="3916"/>
+            <w:tcW w:type="dxa" w:w="3872"/>
             <w:tcBorders>
               <w:top w:val="single" w:color="B7C3D3" w:sz="4"/>
               <w:left w:val="single" w:color="B7C3D3" w:sz="4"/>
@@ -3218,31 +3967,40 @@
         </w:tc>
         <w:tc>
           <w:tcPr>
-            <w:tcW w:type="dxa" w:w="3236"/>
-            <w:tcBorders>
-              <w:top w:val="single" w:color="B7C3D3" w:sz="4"/>
-              <w:left w:val="single" w:color="B7C3D3" w:sz="4"/>
-              <w:bottom w:val="single" w:color="B7C3D3" w:sz="4"/>
-              <w:right w:val="single" w:color="B7C3D3" w:sz="4"/>
-            </w:tcBorders>
-            <w:tcMar>
-              <w:top w:type="dxa" w:w="60"/>
-              <w:left w:type="dxa" w:w="100"/>
-              <w:bottom w:type="dxa" w:w="60"/>
-              <w:right w:type="dxa" w:w="100"/>
-            </w:tcMar>
-          </w:tcPr>
-          <w:p>
-            <w:pPr>
-              <w:spacing w:after="0" w:before="0"/>
-              <w:jc w:val="left"/>
-            </w:pPr>
-            <w:r>
-              <w:rPr>
-                <w:sz w:val="18"/>
-                <w:szCs w:val="18"/>
-              </w:rPr>
-              <w:t xml:space="preserve">Turn on Keycloak JWT validation; keep dev login only under the </w:t>
+            <w:tcW w:type="dxa" w:w="3297"/>
+            <w:tcBorders>
+              <w:top w:val="single" w:color="B7C3D3" w:sz="4"/>
+              <w:left w:val="single" w:color="B7C3D3" w:sz="4"/>
+              <w:bottom w:val="single" w:color="B7C3D3" w:sz="4"/>
+              <w:right w:val="single" w:color="B7C3D3" w:sz="4"/>
+            </w:tcBorders>
+            <w:tcMar>
+              <w:top w:type="dxa" w:w="60"/>
+              <w:left w:type="dxa" w:w="100"/>
+              <w:bottom w:type="dxa" w:w="60"/>
+              <w:right w:type="dxa" w:w="100"/>
+            </w:tcMar>
+          </w:tcPr>
+          <w:p>
+            <w:pPr>
+              <w:spacing w:after="0" w:before="0"/>
+              <w:jc w:val="left"/>
+            </w:pPr>
+            <w:r>
+              <w:rPr>
+                <w:b/>
+                <w:bCs/>
+                <w:sz w:val="18"/>
+                <w:szCs w:val="18"/>
+              </w:rPr>
+              <w:t xml:space="preserve">Now (#79):</w:t>
+            </w:r>
+            <w:r>
+              <w:rPr>
+                <w:sz w:val="18"/>
+                <w:szCs w:val="18"/>
+              </w:rPr>
+              <w:t xml:space="preserve"> bypass is a setting (</w:t>
             </w:r>
             <w:r>
               <w:rPr>
@@ -3251,6 +4009,38 @@
                 <w:szCs w:val="16"/>
                 <w:shd w:fill="EEF1F5" w:color="auto" w:val="clear"/>
               </w:rPr>
+              <w:t xml:space="preserve">app.security.auth-bypass</w:t>
+            </w:r>
+            <w:r>
+              <w:rPr>
+                <w:sz w:val="18"/>
+                <w:szCs w:val="18"/>
+              </w:rPr>
+              <w:t xml:space="preserve">); production no longer has default-password demo users. </w:t>
+            </w:r>
+            <w:r>
+              <w:rPr>
+                <w:b/>
+                <w:bCs/>
+                <w:sz w:val="18"/>
+                <w:szCs w:val="18"/>
+              </w:rPr>
+              <w:t xml:space="preserve">S4:</w:t>
+            </w:r>
+            <w:r>
+              <w:rPr>
+                <w:sz w:val="18"/>
+                <w:szCs w:val="18"/>
+              </w:rPr>
+              <w:t xml:space="preserve"> turn off the bypass per environment (Keycloak JWT); dev login only under </w:t>
+            </w:r>
+            <w:r>
+              <w:rPr>
+                <w:rFonts w:ascii="Consolas" w:cs="Consolas" w:eastAsia="Consolas" w:hAnsi="Consolas"/>
+                <w:sz w:val="16"/>
+                <w:szCs w:val="16"/>
+                <w:shd w:fill="EEF1F5" w:color="auto" w:val="clear"/>
+              </w:rPr>
               <w:t xml:space="preserve">local</w:t>
             </w:r>
             <w:r>
@@ -3258,7 +4048,16 @@
                 <w:sz w:val="18"/>
                 <w:szCs w:val="18"/>
               </w:rPr>
-              <w:t xml:space="preserve"> profile (S1)</w:t>
+              <w:t xml:space="preserve">/</w:t>
+            </w:r>
+            <w:r>
+              <w:rPr>
+                <w:rFonts w:ascii="Consolas" w:cs="Consolas" w:eastAsia="Consolas" w:hAnsi="Consolas"/>
+                <w:sz w:val="16"/>
+                <w:szCs w:val="16"/>
+                <w:shd w:fill="EEF1F5" w:color="auto" w:val="clear"/>
+              </w:rPr>
+              <w:t xml:space="preserve">preview</w:t>
             </w:r>
           </w:p>
         </w:tc>
@@ -3300,7 +4099,7 @@
         </w:tc>
         <w:tc>
           <w:tcPr>
-            <w:tcW w:type="dxa" w:w="1490"/>
+            <w:tcW w:type="dxa" w:w="1473"/>
             <w:tcBorders>
               <w:top w:val="single" w:color="B7C3D3" w:sz="4"/>
               <w:left w:val="single" w:color="B7C3D3" w:sz="4"/>
@@ -3333,7 +4132,7 @@
         </w:tc>
         <w:tc>
           <w:tcPr>
-            <w:tcW w:type="dxa" w:w="3916"/>
+            <w:tcW w:type="dxa" w:w="3872"/>
             <w:tcBorders>
               <w:top w:val="single" w:color="B7C3D3" w:sz="4"/>
               <w:left w:val="single" w:color="B7C3D3" w:sz="4"/>
@@ -3478,7 +4277,7 @@
         </w:tc>
         <w:tc>
           <w:tcPr>
-            <w:tcW w:type="dxa" w:w="3236"/>
+            <w:tcW w:type="dxa" w:w="3297"/>
             <w:tcBorders>
               <w:top w:val="single" w:color="B7C3D3" w:sz="4"/>
               <w:left w:val="single" w:color="B7C3D3" w:sz="4"/>
@@ -3544,7 +4343,7 @@
         </w:tc>
         <w:tc>
           <w:tcPr>
-            <w:tcW w:type="dxa" w:w="1490"/>
+            <w:tcW w:type="dxa" w:w="1473"/>
             <w:tcBorders>
               <w:top w:val="single" w:color="B7C3D3" w:sz="4"/>
               <w:left w:val="single" w:color="B7C3D3" w:sz="4"/>
@@ -3576,7 +4375,7 @@
         </w:tc>
         <w:tc>
           <w:tcPr>
-            <w:tcW w:type="dxa" w:w="3916"/>
+            <w:tcW w:type="dxa" w:w="3872"/>
             <w:tcBorders>
               <w:top w:val="single" w:color="B7C3D3" w:sz="4"/>
               <w:left w:val="single" w:color="B7C3D3" w:sz="4"/>
@@ -3624,7 +4423,7 @@
         </w:tc>
         <w:tc>
           <w:tcPr>
-            <w:tcW w:type="dxa" w:w="3236"/>
+            <w:tcW w:type="dxa" w:w="3297"/>
             <w:tcBorders>
               <w:top w:val="single" w:color="B7C3D3" w:sz="4"/>
               <w:left w:val="single" w:color="B7C3D3" w:sz="4"/>
@@ -3690,7 +4489,7 @@
         </w:tc>
         <w:tc>
           <w:tcPr>
-            <w:tcW w:type="dxa" w:w="1490"/>
+            <w:tcW w:type="dxa" w:w="1473"/>
             <w:tcBorders>
               <w:top w:val="single" w:color="B7C3D3" w:sz="4"/>
               <w:left w:val="single" w:color="B7C3D3" w:sz="4"/>
@@ -3723,7 +4522,7 @@
         </w:tc>
         <w:tc>
           <w:tcPr>
-            <w:tcW w:type="dxa" w:w="3916"/>
+            <w:tcW w:type="dxa" w:w="3872"/>
             <w:tcBorders>
               <w:top w:val="single" w:color="B7C3D3" w:sz="4"/>
               <w:left w:val="single" w:color="B7C3D3" w:sz="4"/>
@@ -3779,7 +4578,7 @@
         </w:tc>
         <w:tc>
           <w:tcPr>
-            <w:tcW w:type="dxa" w:w="3236"/>
+            <w:tcW w:type="dxa" w:w="3297"/>
             <w:tcBorders>
               <w:top w:val="single" w:color="B7C3D3" w:sz="4"/>
               <w:left w:val="single" w:color="B7C3D3" w:sz="4"/>
@@ -3861,7 +4660,7 @@
         </w:tc>
         <w:tc>
           <w:tcPr>
-            <w:tcW w:type="dxa" w:w="1490"/>
+            <w:tcW w:type="dxa" w:w="1473"/>
             <w:tcBorders>
               <w:top w:val="single" w:color="B7C3D3" w:sz="4"/>
               <w:left w:val="single" w:color="B7C3D3" w:sz="4"/>
@@ -3893,7 +4692,7 @@
         </w:tc>
         <w:tc>
           <w:tcPr>
-            <w:tcW w:type="dxa" w:w="3916"/>
+            <w:tcW w:type="dxa" w:w="3872"/>
             <w:tcBorders>
               <w:top w:val="single" w:color="B7C3D3" w:sz="4"/>
               <w:left w:val="single" w:color="B7C3D3" w:sz="4"/>
@@ -3948,7 +4747,7 @@
         </w:tc>
         <w:tc>
           <w:tcPr>
-            <w:tcW w:type="dxa" w:w="3236"/>
+            <w:tcW w:type="dxa" w:w="3297"/>
             <w:tcBorders>
               <w:top w:val="single" w:color="B7C3D3" w:sz="4"/>
               <w:left w:val="single" w:color="B7C3D3" w:sz="4"/>
@@ -4030,7 +4829,7 @@
         </w:tc>
         <w:tc>
           <w:tcPr>
-            <w:tcW w:type="dxa" w:w="1490"/>
+            <w:tcW w:type="dxa" w:w="1473"/>
             <w:tcBorders>
               <w:top w:val="single" w:color="B7C3D3" w:sz="4"/>
               <w:left w:val="single" w:color="B7C3D3" w:sz="4"/>
@@ -4063,7 +4862,7 @@
         </w:tc>
         <w:tc>
           <w:tcPr>
-            <w:tcW w:type="dxa" w:w="3916"/>
+            <w:tcW w:type="dxa" w:w="3872"/>
             <w:tcBorders>
               <w:top w:val="single" w:color="B7C3D3" w:sz="4"/>
               <w:left w:val="single" w:color="B7C3D3" w:sz="4"/>
@@ -4158,7 +4957,7 @@
         </w:tc>
         <w:tc>
           <w:tcPr>
-            <w:tcW w:type="dxa" w:w="3236"/>
+            <w:tcW w:type="dxa" w:w="3297"/>
             <w:tcBorders>
               <w:top w:val="single" w:color="B7C3D3" w:sz="4"/>
               <w:left w:val="single" w:color="B7C3D3" w:sz="4"/>
@@ -4224,7 +5023,7 @@
         </w:tc>
         <w:tc>
           <w:tcPr>
-            <w:tcW w:type="dxa" w:w="1490"/>
+            <w:tcW w:type="dxa" w:w="1473"/>
             <w:tcBorders>
               <w:top w:val="single" w:color="B7C3D3" w:sz="4"/>
               <w:left w:val="single" w:color="B7C3D3" w:sz="4"/>
@@ -4256,7 +5055,7 @@
         </w:tc>
         <w:tc>
           <w:tcPr>
-            <w:tcW w:type="dxa" w:w="3916"/>
+            <w:tcW w:type="dxa" w:w="3872"/>
             <w:tcBorders>
               <w:top w:val="single" w:color="B7C3D3" w:sz="4"/>
               <w:left w:val="single" w:color="B7C3D3" w:sz="4"/>
@@ -4375,7 +5174,7 @@
         </w:tc>
         <w:tc>
           <w:tcPr>
-            <w:tcW w:type="dxa" w:w="3236"/>
+            <w:tcW w:type="dxa" w:w="3297"/>
             <w:tcBorders>
               <w:top w:val="single" w:color="B7C3D3" w:sz="4"/>
               <w:left w:val="single" w:color="B7C3D3" w:sz="4"/>
@@ -4441,7 +5240,7 @@
         </w:tc>
         <w:tc>
           <w:tcPr>
-            <w:tcW w:type="dxa" w:w="1490"/>
+            <w:tcW w:type="dxa" w:w="1473"/>
             <w:tcBorders>
               <w:top w:val="single" w:color="B7C3D3" w:sz="4"/>
               <w:left w:val="single" w:color="B7C3D3" w:sz="4"/>
@@ -4474,7 +5273,7 @@
         </w:tc>
         <w:tc>
           <w:tcPr>
-            <w:tcW w:type="dxa" w:w="3916"/>
+            <w:tcW w:type="dxa" w:w="3872"/>
             <w:tcBorders>
               <w:top w:val="single" w:color="B7C3D3" w:sz="4"/>
               <w:left w:val="single" w:color="B7C3D3" w:sz="4"/>
@@ -4537,7 +5336,7 @@
         </w:tc>
         <w:tc>
           <w:tcPr>
-            <w:tcW w:type="dxa" w:w="3236"/>
+            <w:tcW w:type="dxa" w:w="3297"/>
             <w:tcBorders>
               <w:top w:val="single" w:color="B7C3D3" w:sz="4"/>
               <w:left w:val="single" w:color="B7C3D3" w:sz="4"/>
@@ -4603,7 +5402,7 @@
         </w:tc>
         <w:tc>
           <w:tcPr>
-            <w:tcW w:type="dxa" w:w="1490"/>
+            <w:tcW w:type="dxa" w:w="1473"/>
             <w:tcBorders>
               <w:top w:val="single" w:color="B7C3D3" w:sz="4"/>
               <w:left w:val="single" w:color="B7C3D3" w:sz="4"/>
@@ -4635,7 +5434,7 @@
         </w:tc>
         <w:tc>
           <w:tcPr>
-            <w:tcW w:type="dxa" w:w="3916"/>
+            <w:tcW w:type="dxa" w:w="3872"/>
             <w:tcBorders>
               <w:top w:val="single" w:color="B7C3D3" w:sz="4"/>
               <w:left w:val="single" w:color="B7C3D3" w:sz="4"/>
@@ -4761,7 +5560,7 @@
         </w:tc>
         <w:tc>
           <w:tcPr>
-            <w:tcW w:type="dxa" w:w="3236"/>
+            <w:tcW w:type="dxa" w:w="3297"/>
             <w:tcBorders>
               <w:top w:val="single" w:color="B7C3D3" w:sz="4"/>
               <w:left w:val="single" w:color="B7C3D3" w:sz="4"/>
@@ -9278,7 +10077,7 @@
         <w:t xml:space="preserve">Services:</w:t>
       </w:r>
       <w:r>
-        <w:t xml:space="preserve"> remove </w:t>
+        <w:t xml:space="preserve"> set </w:t>
       </w:r>
       <w:r>
         <w:rPr>
@@ -9287,22 +10086,10 @@
           <w:szCs w:val="18"/>
           <w:shd w:fill="EEF1F5" w:color="auto" w:val="clear"/>
         </w:rPr>
-        <w:t xml:space="preserve">TEMPORARY_AUTH_BYPASS</w:t>
-      </w:r>
-      <w:r>
-        <w:t xml:space="preserve"> and stop excluding </w:t>
-      </w:r>
-      <w:r>
-        <w:rPr>
-          <w:rFonts w:ascii="Consolas" w:cs="Consolas" w:eastAsia="Consolas" w:hAnsi="Consolas"/>
-          <w:sz w:val="18"/>
-          <w:szCs w:val="18"/>
-          <w:shd w:fill="EEF1F5" w:color="auto" w:val="clear"/>
-        </w:rPr>
-        <w:t xml:space="preserve">OAuth2ResourceServerAutoConfiguration</w:t>
-      </w:r>
-      <w:r>
-        <w:t xml:space="preserve">. Enable </w:t>
+        <w:t xml:space="preserve">app.security.auth-bypass=false</w:t>
+      </w:r>
+      <w:r>
+        <w:t xml:space="preserve"> per environment (done as a setting in #79; the cut-over is in S4). With the bypass off, </w:t>
       </w:r>
       <w:r>
         <w:rPr>
@@ -9314,7 +10101,7 @@
         <w:t xml:space="preserve">oauth2ResourceServer().jwt()</w:t>
       </w:r>
       <w:r>
-        <w:t xml:space="preserve">. The existing </w:t>
+        <w:t xml:space="preserve"> validates Keycloak tokens using a lazily-built JWT decoder. The existing </w:t>
       </w:r>
       <w:r>
         <w:rPr>
@@ -16331,6 +17118,720 @@
         <w:pStyle w:val="Heading2"/>
       </w:pPr>
       <w:r>
+        <w:t xml:space="preserve">8.0 Progress (as of 11 Oct 2026)</w:t>
+      </w:r>
+    </w:p>
+    <w:tbl>
+      <w:tblPr>
+        <w:tblW w:type="dxa" w:w="9638"/>
+        <w:tblBorders>
+          <w:top w:val="single" w:color="auto" w:sz="4"/>
+          <w:left w:val="single" w:color="auto" w:sz="4"/>
+          <w:bottom w:val="single" w:color="auto" w:sz="4"/>
+          <w:right w:val="single" w:color="auto" w:sz="4"/>
+          <w:insideH w:val="single" w:color="auto" w:sz="4"/>
+          <w:insideV w:val="single" w:color="auto" w:sz="4"/>
+        </w:tblBorders>
+        <w:tblLayout w:type="fixed"/>
+      </w:tblPr>
+      <w:tblGrid>
+        <w:gridCol w:w="5290"/>
+        <w:gridCol w:w="4348"/>
+      </w:tblGrid>
+      <w:tr>
+        <w:trPr>
+          <w:cantSplit/>
+          <w:tblHeader/>
+        </w:trPr>
+        <w:tc>
+          <w:tcPr>
+            <w:tcW w:type="dxa" w:w="5290"/>
+            <w:tcBorders>
+              <w:top w:val="single" w:color="B7C3D3" w:sz="4"/>
+              <w:left w:val="single" w:color="B7C3D3" w:sz="4"/>
+              <w:bottom w:val="single" w:color="B7C3D3" w:sz="4"/>
+              <w:right w:val="single" w:color="B7C3D3" w:sz="4"/>
+            </w:tcBorders>
+            <w:shd w:fill="1F3A5F" w:color="auto" w:val="clear"/>
+            <w:tcMar>
+              <w:top w:type="dxa" w:w="60"/>
+              <w:left w:type="dxa" w:w="100"/>
+              <w:bottom w:type="dxa" w:w="60"/>
+              <w:right w:type="dxa" w:w="100"/>
+            </w:tcMar>
+          </w:tcPr>
+          <w:p>
+            <w:pPr>
+              <w:spacing w:after="0" w:before="0"/>
+              <w:jc w:val="left"/>
+            </w:pPr>
+            <w:r>
+              <w:rPr>
+                <w:b/>
+                <w:bCs/>
+                <w:color w:val="FFFFFF"/>
+                <w:sz w:val="18"/>
+                <w:szCs w:val="18"/>
+              </w:rPr>
+              <w:t xml:space="preserve">Sprint 0 item</w:t>
+            </w:r>
+          </w:p>
+        </w:tc>
+        <w:tc>
+          <w:tcPr>
+            <w:tcW w:type="dxa" w:w="4348"/>
+            <w:tcBorders>
+              <w:top w:val="single" w:color="B7C3D3" w:sz="4"/>
+              <w:left w:val="single" w:color="B7C3D3" w:sz="4"/>
+              <w:bottom w:val="single" w:color="B7C3D3" w:sz="4"/>
+              <w:right w:val="single" w:color="B7C3D3" w:sz="4"/>
+            </w:tcBorders>
+            <w:shd w:fill="1F3A5F" w:color="auto" w:val="clear"/>
+            <w:tcMar>
+              <w:top w:type="dxa" w:w="60"/>
+              <w:left w:type="dxa" w:w="100"/>
+              <w:bottom w:type="dxa" w:w="60"/>
+              <w:right w:type="dxa" w:w="100"/>
+            </w:tcMar>
+          </w:tcPr>
+          <w:p>
+            <w:pPr>
+              <w:spacing w:after="0" w:before="0"/>
+              <w:jc w:val="left"/>
+            </w:pPr>
+            <w:r>
+              <w:rPr>
+                <w:b/>
+                <w:bCs/>
+                <w:color w:val="FFFFFF"/>
+                <w:sz w:val="18"/>
+                <w:szCs w:val="18"/>
+              </w:rPr>
+              <w:t xml:space="preserve">Status</w:t>
+            </w:r>
+          </w:p>
+        </w:tc>
+      </w:tr>
+      <w:tr>
+        <w:trPr>
+          <w:cantSplit/>
+        </w:trPr>
+        <w:tc>
+          <w:tcPr>
+            <w:tcW w:type="dxa" w:w="5290"/>
+            <w:tcBorders>
+              <w:top w:val="single" w:color="B7C3D3" w:sz="4"/>
+              <w:left w:val="single" w:color="B7C3D3" w:sz="4"/>
+              <w:bottom w:val="single" w:color="B7C3D3" w:sz="4"/>
+              <w:right w:val="single" w:color="B7C3D3" w:sz="4"/>
+            </w:tcBorders>
+            <w:tcMar>
+              <w:top w:type="dxa" w:w="60"/>
+              <w:left w:type="dxa" w:w="100"/>
+              <w:bottom w:type="dxa" w:w="60"/>
+              <w:right w:type="dxa" w:w="100"/>
+            </w:tcMar>
+          </w:tcPr>
+          <w:p>
+            <w:pPr>
+              <w:spacing w:after="0" w:before="0"/>
+              <w:jc w:val="left"/>
+            </w:pPr>
+            <w:r>
+              <w:rPr>
+                <w:sz w:val="18"/>
+                <w:szCs w:val="18"/>
+              </w:rPr>
+              <w:t xml:space="preserve">Plan in the repo</w:t>
+            </w:r>
+          </w:p>
+        </w:tc>
+        <w:tc>
+          <w:tcPr>
+            <w:tcW w:type="dxa" w:w="4348"/>
+            <w:tcBorders>
+              <w:top w:val="single" w:color="B7C3D3" w:sz="4"/>
+              <w:left w:val="single" w:color="B7C3D3" w:sz="4"/>
+              <w:bottom w:val="single" w:color="B7C3D3" w:sz="4"/>
+              <w:right w:val="single" w:color="B7C3D3" w:sz="4"/>
+            </w:tcBorders>
+            <w:tcMar>
+              <w:top w:type="dxa" w:w="60"/>
+              <w:left w:type="dxa" w:w="100"/>
+              <w:bottom w:type="dxa" w:w="60"/>
+              <w:right w:type="dxa" w:w="100"/>
+            </w:tcMar>
+          </w:tcPr>
+          <w:p>
+            <w:pPr>
+              <w:spacing w:after="0" w:before="0"/>
+              <w:jc w:val="left"/>
+            </w:pPr>
+            <w:r>
+              <w:rPr>
+                <w:sz w:val="18"/>
+                <w:szCs w:val="18"/>
+              </w:rPr>
+              <w:t xml:space="preserve">✓ merged (#73)</w:t>
+            </w:r>
+          </w:p>
+        </w:tc>
+      </w:tr>
+      <w:tr>
+        <w:trPr>
+          <w:cantSplit/>
+        </w:trPr>
+        <w:tc>
+          <w:tcPr>
+            <w:tcW w:type="dxa" w:w="5290"/>
+            <w:tcBorders>
+              <w:top w:val="single" w:color="B7C3D3" w:sz="4"/>
+              <w:left w:val="single" w:color="B7C3D3" w:sz="4"/>
+              <w:bottom w:val="single" w:color="B7C3D3" w:sz="4"/>
+              <w:right w:val="single" w:color="B7C3D3" w:sz="4"/>
+            </w:tcBorders>
+            <w:shd w:fill="F3F6FA" w:color="auto" w:val="clear"/>
+            <w:tcMar>
+              <w:top w:type="dxa" w:w="60"/>
+              <w:left w:type="dxa" w:w="100"/>
+              <w:bottom w:type="dxa" w:w="60"/>
+              <w:right w:type="dxa" w:w="100"/>
+            </w:tcMar>
+          </w:tcPr>
+          <w:p>
+            <w:pPr>
+              <w:spacing w:after="0" w:before="0"/>
+              <w:jc w:val="left"/>
+            </w:pPr>
+            <w:r>
+              <w:rPr>
+                <w:sz w:val="18"/>
+                <w:szCs w:val="18"/>
+              </w:rPr>
+              <w:t xml:space="preserve">Actuator health/metrics, SLF4J logging, 404/405 instead of 500</w:t>
+            </w:r>
+          </w:p>
+        </w:tc>
+        <w:tc>
+          <w:tcPr>
+            <w:tcW w:type="dxa" w:w="4348"/>
+            <w:tcBorders>
+              <w:top w:val="single" w:color="B7C3D3" w:sz="4"/>
+              <w:left w:val="single" w:color="B7C3D3" w:sz="4"/>
+              <w:bottom w:val="single" w:color="B7C3D3" w:sz="4"/>
+              <w:right w:val="single" w:color="B7C3D3" w:sz="4"/>
+            </w:tcBorders>
+            <w:shd w:fill="F3F6FA" w:color="auto" w:val="clear"/>
+            <w:tcMar>
+              <w:top w:type="dxa" w:w="60"/>
+              <w:left w:type="dxa" w:w="100"/>
+              <w:bottom w:type="dxa" w:w="60"/>
+              <w:right w:type="dxa" w:w="100"/>
+            </w:tcMar>
+          </w:tcPr>
+          <w:p>
+            <w:pPr>
+              <w:spacing w:after="0" w:before="0"/>
+              <w:jc w:val="left"/>
+            </w:pPr>
+            <w:r>
+              <w:rPr>
+                <w:sz w:val="18"/>
+                <w:szCs w:val="18"/>
+              </w:rPr>
+              <w:t xml:space="preserve">✓ merged (#74)</w:t>
+            </w:r>
+          </w:p>
+        </w:tc>
+      </w:tr>
+      <w:tr>
+        <w:trPr>
+          <w:cantSplit/>
+        </w:trPr>
+        <w:tc>
+          <w:tcPr>
+            <w:tcW w:type="dxa" w:w="5290"/>
+            <w:tcBorders>
+              <w:top w:val="single" w:color="B7C3D3" w:sz="4"/>
+              <w:left w:val="single" w:color="B7C3D3" w:sz="4"/>
+              <w:bottom w:val="single" w:color="B7C3D3" w:sz="4"/>
+              <w:right w:val="single" w:color="B7C3D3" w:sz="4"/>
+            </w:tcBorders>
+            <w:tcMar>
+              <w:top w:type="dxa" w:w="60"/>
+              <w:left w:type="dxa" w:w="100"/>
+              <w:bottom w:type="dxa" w:w="60"/>
+              <w:right w:type="dxa" w:w="100"/>
+            </w:tcMar>
+          </w:tcPr>
+          <w:p>
+            <w:pPr>
+              <w:spacing w:after="0" w:before="0"/>
+              <w:jc w:val="left"/>
+            </w:pPr>
+            <w:r>
+              <w:rPr>
+                <w:sz w:val="18"/>
+                <w:szCs w:val="18"/>
+              </w:rPr>
+              <w:t xml:space="preserve">Flyway baseline (V4) for the Hibernate-managed tables; </w:t>
+            </w:r>
+            <w:r>
+              <w:rPr>
+                <w:rFonts w:ascii="Consolas" w:cs="Consolas" w:eastAsia="Consolas" w:hAnsi="Consolas"/>
+                <w:sz w:val="16"/>
+                <w:szCs w:val="16"/>
+                <w:shd w:fill="EEF1F5" w:color="auto" w:val="clear"/>
+              </w:rPr>
+              <w:t xml:space="preserve">validate</w:t>
+            </w:r>
+            <w:r>
+              <w:rPr>
+                <w:sz w:val="18"/>
+                <w:szCs w:val="18"/>
+              </w:rPr>
+              <w:t xml:space="preserve"> in previews</w:t>
+            </w:r>
+          </w:p>
+        </w:tc>
+        <w:tc>
+          <w:tcPr>
+            <w:tcW w:type="dxa" w:w="4348"/>
+            <w:tcBorders>
+              <w:top w:val="single" w:color="B7C3D3" w:sz="4"/>
+              <w:left w:val="single" w:color="B7C3D3" w:sz="4"/>
+              <w:bottom w:val="single" w:color="B7C3D3" w:sz="4"/>
+              <w:right w:val="single" w:color="B7C3D3" w:sz="4"/>
+            </w:tcBorders>
+            <w:tcMar>
+              <w:top w:type="dxa" w:w="60"/>
+              <w:left w:type="dxa" w:w="100"/>
+              <w:bottom w:type="dxa" w:w="60"/>
+              <w:right w:type="dxa" w:w="100"/>
+            </w:tcMar>
+          </w:tcPr>
+          <w:p>
+            <w:pPr>
+              <w:spacing w:after="0" w:before="0"/>
+              <w:jc w:val="left"/>
+            </w:pPr>
+            <w:r>
+              <w:rPr>
+                <w:sz w:val="18"/>
+                <w:szCs w:val="18"/>
+              </w:rPr>
+              <w:t xml:space="preserve">✓ merged (#75)</w:t>
+            </w:r>
+          </w:p>
+        </w:tc>
+      </w:tr>
+      <w:tr>
+        <w:trPr>
+          <w:cantSplit/>
+        </w:trPr>
+        <w:tc>
+          <w:tcPr>
+            <w:tcW w:type="dxa" w:w="5290"/>
+            <w:tcBorders>
+              <w:top w:val="single" w:color="B7C3D3" w:sz="4"/>
+              <w:left w:val="single" w:color="B7C3D3" w:sz="4"/>
+              <w:bottom w:val="single" w:color="B7C3D3" w:sz="4"/>
+              <w:right w:val="single" w:color="B7C3D3" w:sz="4"/>
+            </w:tcBorders>
+            <w:shd w:fill="F3F6FA" w:color="auto" w:val="clear"/>
+            <w:tcMar>
+              <w:top w:type="dxa" w:w="60"/>
+              <w:left w:type="dxa" w:w="100"/>
+              <w:bottom w:type="dxa" w:w="60"/>
+              <w:right w:type="dxa" w:w="100"/>
+            </w:tcMar>
+          </w:tcPr>
+          <w:p>
+            <w:pPr>
+              <w:spacing w:after="0" w:before="0"/>
+              <w:jc w:val="left"/>
+            </w:pPr>
+            <w:r>
+              <w:rPr>
+                <w:sz w:val="18"/>
+                <w:szCs w:val="18"/>
+              </w:rPr>
+              <w:t xml:space="preserve">Front end: pinned dependencies, Vitest, ESLint, leftovers removed</w:t>
+            </w:r>
+          </w:p>
+        </w:tc>
+        <w:tc>
+          <w:tcPr>
+            <w:tcW w:type="dxa" w:w="4348"/>
+            <w:tcBorders>
+              <w:top w:val="single" w:color="B7C3D3" w:sz="4"/>
+              <w:left w:val="single" w:color="B7C3D3" w:sz="4"/>
+              <w:bottom w:val="single" w:color="B7C3D3" w:sz="4"/>
+              <w:right w:val="single" w:color="B7C3D3" w:sz="4"/>
+            </w:tcBorders>
+            <w:shd w:fill="F3F6FA" w:color="auto" w:val="clear"/>
+            <w:tcMar>
+              <w:top w:type="dxa" w:w="60"/>
+              <w:left w:type="dxa" w:w="100"/>
+              <w:bottom w:type="dxa" w:w="60"/>
+              <w:right w:type="dxa" w:w="100"/>
+            </w:tcMar>
+          </w:tcPr>
+          <w:p>
+            <w:pPr>
+              <w:spacing w:after="0" w:before="0"/>
+              <w:jc w:val="left"/>
+            </w:pPr>
+            <w:r>
+              <w:rPr>
+                <w:sz w:val="18"/>
+                <w:szCs w:val="18"/>
+              </w:rPr>
+              <w:t xml:space="preserve">PR #76 (green)</w:t>
+            </w:r>
+          </w:p>
+        </w:tc>
+      </w:tr>
+      <w:tr>
+        <w:trPr>
+          <w:cantSplit/>
+        </w:trPr>
+        <w:tc>
+          <w:tcPr>
+            <w:tcW w:type="dxa" w:w="5290"/>
+            <w:tcBorders>
+              <w:top w:val="single" w:color="B7C3D3" w:sz="4"/>
+              <w:left w:val="single" w:color="B7C3D3" w:sz="4"/>
+              <w:bottom w:val="single" w:color="B7C3D3" w:sz="4"/>
+              <w:right w:val="single" w:color="B7C3D3" w:sz="4"/>
+            </w:tcBorders>
+            <w:tcMar>
+              <w:top w:type="dxa" w:w="60"/>
+              <w:left w:type="dxa" w:w="100"/>
+              <w:bottom w:type="dxa" w:w="60"/>
+              <w:right w:type="dxa" w:w="100"/>
+            </w:tcMar>
+          </w:tcPr>
+          <w:p>
+            <w:pPr>
+              <w:spacing w:after="0" w:before="0"/>
+              <w:jc w:val="left"/>
+            </w:pPr>
+            <w:r>
+              <w:rPr>
+                <w:sz w:val="18"/>
+                <w:szCs w:val="18"/>
+              </w:rPr>
+              <w:t xml:space="preserve">Jenkins: frontend lint/tests, report-only gitleaks + Trivy scans</w:t>
+            </w:r>
+          </w:p>
+        </w:tc>
+        <w:tc>
+          <w:tcPr>
+            <w:tcW w:type="dxa" w:w="4348"/>
+            <w:tcBorders>
+              <w:top w:val="single" w:color="B7C3D3" w:sz="4"/>
+              <w:left w:val="single" w:color="B7C3D3" w:sz="4"/>
+              <w:bottom w:val="single" w:color="B7C3D3" w:sz="4"/>
+              <w:right w:val="single" w:color="B7C3D3" w:sz="4"/>
+            </w:tcBorders>
+            <w:tcMar>
+              <w:top w:type="dxa" w:w="60"/>
+              <w:left w:type="dxa" w:w="100"/>
+              <w:bottom w:type="dxa" w:w="60"/>
+              <w:right w:type="dxa" w:w="100"/>
+            </w:tcMar>
+          </w:tcPr>
+          <w:p>
+            <w:pPr>
+              <w:spacing w:after="0" w:before="0"/>
+              <w:jc w:val="left"/>
+            </w:pPr>
+            <w:r>
+              <w:rPr>
+                <w:sz w:val="18"/>
+                <w:szCs w:val="18"/>
+              </w:rPr>
+              <w:t xml:space="preserve">PR #77 (first build failed on the agent; investigating)</w:t>
+            </w:r>
+          </w:p>
+        </w:tc>
+      </w:tr>
+      <w:tr>
+        <w:trPr>
+          <w:cantSplit/>
+        </w:trPr>
+        <w:tc>
+          <w:tcPr>
+            <w:tcW w:type="dxa" w:w="5290"/>
+            <w:tcBorders>
+              <w:top w:val="single" w:color="B7C3D3" w:sz="4"/>
+              <w:left w:val="single" w:color="B7C3D3" w:sz="4"/>
+              <w:bottom w:val="single" w:color="B7C3D3" w:sz="4"/>
+              <w:right w:val="single" w:color="B7C3D3" w:sz="4"/>
+            </w:tcBorders>
+            <w:shd w:fill="F3F6FA" w:color="auto" w:val="clear"/>
+            <w:tcMar>
+              <w:top w:type="dxa" w:w="60"/>
+              <w:left w:type="dxa" w:w="100"/>
+              <w:bottom w:type="dxa" w:w="60"/>
+              <w:right w:type="dxa" w:w="100"/>
+            </w:tcMar>
+          </w:tcPr>
+          <w:p>
+            <w:pPr>
+              <w:spacing w:after="0" w:before="0"/>
+              <w:jc w:val="left"/>
+            </w:pPr>
+            <w:r>
+              <w:rPr>
+                <w:sz w:val="18"/>
+                <w:szCs w:val="18"/>
+              </w:rPr>
+              <w:t xml:space="preserve">Spring Boot 3.3.5 → 3.5.16 + patched dependencies (51 → 2 backend findings)</w:t>
+            </w:r>
+          </w:p>
+        </w:tc>
+        <w:tc>
+          <w:tcPr>
+            <w:tcW w:type="dxa" w:w="4348"/>
+            <w:tcBorders>
+              <w:top w:val="single" w:color="B7C3D3" w:sz="4"/>
+              <w:left w:val="single" w:color="B7C3D3" w:sz="4"/>
+              <w:bottom w:val="single" w:color="B7C3D3" w:sz="4"/>
+              <w:right w:val="single" w:color="B7C3D3" w:sz="4"/>
+            </w:tcBorders>
+            <w:shd w:fill="F3F6FA" w:color="auto" w:val="clear"/>
+            <w:tcMar>
+              <w:top w:type="dxa" w:w="60"/>
+              <w:left w:type="dxa" w:w="100"/>
+              <w:bottom w:type="dxa" w:w="60"/>
+              <w:right w:type="dxa" w:w="100"/>
+            </w:tcMar>
+          </w:tcPr>
+          <w:p>
+            <w:pPr>
+              <w:spacing w:after="0" w:before="0"/>
+              <w:jc w:val="left"/>
+            </w:pPr>
+            <w:r>
+              <w:rPr>
+                <w:sz w:val="18"/>
+                <w:szCs w:val="18"/>
+              </w:rPr>
+              <w:t xml:space="preserve">PR #78 (green)</w:t>
+            </w:r>
+          </w:p>
+        </w:tc>
+      </w:tr>
+      <w:tr>
+        <w:trPr>
+          <w:cantSplit/>
+        </w:trPr>
+        <w:tc>
+          <w:tcPr>
+            <w:tcW w:type="dxa" w:w="5290"/>
+            <w:tcBorders>
+              <w:top w:val="single" w:color="B7C3D3" w:sz="4"/>
+              <w:left w:val="single" w:color="B7C3D3" w:sz="4"/>
+              <w:bottom w:val="single" w:color="B7C3D3" w:sz="4"/>
+              <w:right w:val="single" w:color="B7C3D3" w:sz="4"/>
+            </w:tcBorders>
+            <w:tcMar>
+              <w:top w:type="dxa" w:w="60"/>
+              <w:left w:type="dxa" w:w="100"/>
+              <w:bottom w:type="dxa" w:w="60"/>
+              <w:right w:type="dxa" w:w="100"/>
+            </w:tcMar>
+          </w:tcPr>
+          <w:p>
+            <w:pPr>
+              <w:spacing w:after="0" w:before="0"/>
+              <w:jc w:val="left"/>
+            </w:pPr>
+            <w:r>
+              <w:rPr>
+                <w:sz w:val="18"/>
+                <w:szCs w:val="18"/>
+              </w:rPr>
+              <w:t xml:space="preserve">Production demo users removed; auth bypass as a setting</w:t>
+            </w:r>
+          </w:p>
+        </w:tc>
+        <w:tc>
+          <w:tcPr>
+            <w:tcW w:type="dxa" w:w="4348"/>
+            <w:tcBorders>
+              <w:top w:val="single" w:color="B7C3D3" w:sz="4"/>
+              <w:left w:val="single" w:color="B7C3D3" w:sz="4"/>
+              <w:bottom w:val="single" w:color="B7C3D3" w:sz="4"/>
+              <w:right w:val="single" w:color="B7C3D3" w:sz="4"/>
+            </w:tcBorders>
+            <w:tcMar>
+              <w:top w:type="dxa" w:w="60"/>
+              <w:left w:type="dxa" w:w="100"/>
+              <w:bottom w:type="dxa" w:w="60"/>
+              <w:right w:type="dxa" w:w="100"/>
+            </w:tcMar>
+          </w:tcPr>
+          <w:p>
+            <w:pPr>
+              <w:spacing w:after="0" w:before="0"/>
+              <w:jc w:val="left"/>
+            </w:pPr>
+            <w:r>
+              <w:rPr>
+                <w:sz w:val="18"/>
+                <w:szCs w:val="18"/>
+              </w:rPr>
+              <w:t xml:space="preserve">PR #79 (green)</w:t>
+            </w:r>
+          </w:p>
+        </w:tc>
+      </w:tr>
+      <w:tr>
+        <w:trPr>
+          <w:cantSplit/>
+        </w:trPr>
+        <w:tc>
+          <w:tcPr>
+            <w:tcW w:type="dxa" w:w="5290"/>
+            <w:tcBorders>
+              <w:top w:val="single" w:color="B7C3D3" w:sz="4"/>
+              <w:left w:val="single" w:color="B7C3D3" w:sz="4"/>
+              <w:bottom w:val="single" w:color="B7C3D3" w:sz="4"/>
+              <w:right w:val="single" w:color="B7C3D3" w:sz="4"/>
+            </w:tcBorders>
+            <w:shd w:fill="F3F6FA" w:color="auto" w:val="clear"/>
+            <w:tcMar>
+              <w:top w:type="dxa" w:w="60"/>
+              <w:left w:type="dxa" w:w="100"/>
+              <w:bottom w:type="dxa" w:w="60"/>
+              <w:right w:type="dxa" w:w="100"/>
+            </w:tcMar>
+          </w:tcPr>
+          <w:p>
+            <w:pPr>
+              <w:spacing w:after="0" w:before="0"/>
+              <w:jc w:val="left"/>
+            </w:pPr>
+            <w:r>
+              <w:rPr>
+                <w:sz w:val="18"/>
+                <w:szCs w:val="18"/>
+              </w:rPr>
+              <w:t xml:space="preserve">Maven multi-module restructure</w:t>
+            </w:r>
+          </w:p>
+        </w:tc>
+        <w:tc>
+          <w:tcPr>
+            <w:tcW w:type="dxa" w:w="4348"/>
+            <w:tcBorders>
+              <w:top w:val="single" w:color="B7C3D3" w:sz="4"/>
+              <w:left w:val="single" w:color="B7C3D3" w:sz="4"/>
+              <w:bottom w:val="single" w:color="B7C3D3" w:sz="4"/>
+              <w:right w:val="single" w:color="B7C3D3" w:sz="4"/>
+            </w:tcBorders>
+            <w:shd w:fill="F3F6FA" w:color="auto" w:val="clear"/>
+            <w:tcMar>
+              <w:top w:type="dxa" w:w="60"/>
+              <w:left w:type="dxa" w:w="100"/>
+              <w:bottom w:type="dxa" w:w="60"/>
+              <w:right w:type="dxa" w:w="100"/>
+            </w:tcMar>
+          </w:tcPr>
+          <w:p>
+            <w:pPr>
+              <w:spacing w:after="0" w:before="0"/>
+              <w:jc w:val="left"/>
+            </w:pPr>
+            <w:r>
+              <w:rPr>
+                <w:sz w:val="18"/>
+                <w:szCs w:val="18"/>
+              </w:rPr>
+              <w:t xml:space="preserve">Not started; needs a slot agreed with the team (moves every backend file)</w:t>
+            </w:r>
+          </w:p>
+        </w:tc>
+      </w:tr>
+      <w:tr>
+        <w:trPr>
+          <w:cantSplit/>
+        </w:trPr>
+        <w:tc>
+          <w:tcPr>
+            <w:tcW w:type="dxa" w:w="5290"/>
+            <w:tcBorders>
+              <w:top w:val="single" w:color="B7C3D3" w:sz="4"/>
+              <w:left w:val="single" w:color="B7C3D3" w:sz="4"/>
+              <w:bottom w:val="single" w:color="B7C3D3" w:sz="4"/>
+              <w:right w:val="single" w:color="B7C3D3" w:sz="4"/>
+            </w:tcBorders>
+            <w:tcMar>
+              <w:top w:type="dxa" w:w="60"/>
+              <w:left w:type="dxa" w:w="100"/>
+              <w:bottom w:type="dxa" w:w="60"/>
+              <w:right w:type="dxa" w:w="100"/>
+            </w:tcMar>
+          </w:tcPr>
+          <w:p>
+            <w:pPr>
+              <w:spacing w:after="0" w:before="0"/>
+              <w:jc w:val="left"/>
+            </w:pPr>
+            <w:r>
+              <w:rPr>
+                <w:sz w:val="18"/>
+                <w:szCs w:val="18"/>
+              </w:rPr>
+              <w:t xml:space="preserve">Full-stack docker-compose, ADRs</w:t>
+            </w:r>
+          </w:p>
+        </w:tc>
+        <w:tc>
+          <w:tcPr>
+            <w:tcW w:type="dxa" w:w="4348"/>
+            <w:tcBorders>
+              <w:top w:val="single" w:color="B7C3D3" w:sz="4"/>
+              <w:left w:val="single" w:color="B7C3D3" w:sz="4"/>
+              <w:bottom w:val="single" w:color="B7C3D3" w:sz="4"/>
+              <w:right w:val="single" w:color="B7C3D3" w:sz="4"/>
+            </w:tcBorders>
+            <w:tcMar>
+              <w:top w:type="dxa" w:w="60"/>
+              <w:left w:type="dxa" w:w="100"/>
+              <w:bottom w:type="dxa" w:w="60"/>
+              <w:right w:type="dxa" w:w="100"/>
+            </w:tcMar>
+          </w:tcPr>
+          <w:p>
+            <w:pPr>
+              <w:spacing w:after="0" w:before="0"/>
+              <w:jc w:val="left"/>
+            </w:pPr>
+            <w:r>
+              <w:rPr>
+                <w:sz w:val="18"/>
+                <w:szCs w:val="18"/>
+              </w:rPr>
+              <w:t xml:space="preserve">Not started</w:t>
+            </w:r>
+          </w:p>
+        </w:tc>
+      </w:tr>
+    </w:tbl>
+    <w:p>
+      <w:pPr>
+        <w:spacing w:after="120"/>
+      </w:pPr>
+    </w:p>
+    <w:p>
+      <w:pPr>
+        <w:pStyle w:val="Heading2"/>
+      </w:pPr>
+      <w:r>
         <w:t xml:space="preserve">8.2 Sprint backlog</w:t>
       </w:r>
     </w:p>
@@ -16549,7 +18050,7 @@
           <w:b/>
           <w:bCs/>
         </w:rPr>
-        <w:t xml:space="preserve">S1 — Auth, state and storage (12 – 23 Oct)</w:t>
+        <w:t xml:space="preserve">S1 — State, storage and scheduling (12 – 23 Oct)</w:t>
       </w:r>
     </w:p>
     <w:p>
@@ -16562,7 +18063,7 @@
         <w:spacing w:after="60"/>
       </w:pPr>
       <w:r>
-        <w:t xml:space="preserve">Keycloak JWT enabled; </w:t>
+        <w:t xml:space="preserve">Redis-backed job state for the risk engine and batch progress; ShedLock on </w:t>
       </w:r>
       <w:r>
         <w:rPr>
@@ -16571,19 +18072,7 @@
           <w:szCs w:val="18"/>
           <w:shd w:fill="EEF1F5" w:color="auto" w:val="clear"/>
         </w:rPr>
-        <w:t xml:space="preserve">TEMPORARY_AUTH_BYPASS</w:t>
-      </w:r>
-      <w:r>
-        <w:t xml:space="preserve"> removed; Keycloak realm roles mapped to the 20 RBAC roles and permission codes; dev login limited to </w:t>
-      </w:r>
-      <w:r>
-        <w:rPr>
-          <w:rFonts w:ascii="Consolas" w:cs="Consolas" w:eastAsia="Consolas" w:hAnsi="Consolas"/>
-          <w:sz w:val="18"/>
-          <w:szCs w:val="18"/>
-          <w:shd w:fill="EEF1F5" w:color="auto" w:val="clear"/>
-        </w:rPr>
-        <w:t xml:space="preserve">@Profile("local")</w:t>
+        <w:t xml:space="preserve">SpringDynamicSchedulerService</w:t>
       </w:r>
       <w:r>
         <w:t xml:space="preserve">.</w:t>
@@ -16599,7 +18088,16 @@
         <w:spacing w:after="60"/>
       </w:pPr>
       <w:r>
-        <w:t xml:space="preserve">Authorisation tests per endpoint and role.</w:t>
+        <w:rPr>
+          <w:rFonts w:ascii="Consolas" w:cs="Consolas" w:eastAsia="Consolas" w:hAnsi="Consolas"/>
+          <w:sz w:val="18"/>
+          <w:szCs w:val="18"/>
+          <w:shd w:fill="EEF1F5" w:color="auto" w:val="clear"/>
+        </w:rPr>
+        <w:t xml:space="preserve">S3FileStorageService</w:t>
+      </w:r>
+      <w:r>
+        <w:t xml:space="preserve"> (MinIO locally).</w:t>
       </w:r>
     </w:p>
     <w:p>
@@ -16612,19 +18110,16 @@
         <w:spacing w:after="60"/>
       </w:pPr>
       <w:r>
-        <w:t xml:space="preserve">Redis-backed job state for the risk engine and batch progress; ShedLock on </w:t>
-      </w:r>
-      <w:r>
         <w:rPr>
           <w:rFonts w:ascii="Consolas" w:cs="Consolas" w:eastAsia="Consolas" w:hAnsi="Consolas"/>
           <w:sz w:val="18"/>
           <w:szCs w:val="18"/>
           <w:shd w:fill="EEF1F5" w:color="auto" w:val="clear"/>
         </w:rPr>
-        <w:t xml:space="preserve">SpringDynamicSchedulerService</w:t>
-      </w:r>
-      <w:r>
-        <w:t xml:space="preserve">.</w:t>
+        <w:t xml:space="preserve">trade_version</w:t>
+      </w:r>
+      <w:r>
+        <w:t xml:space="preserve"> audit table, written on every lifecycle action; shown in the blotter's trade history.</w:t>
       </w:r>
     </w:p>
     <w:p>
@@ -16637,16 +18132,7 @@
         <w:spacing w:after="60"/>
       </w:pPr>
       <w:r>
-        <w:rPr>
-          <w:rFonts w:ascii="Consolas" w:cs="Consolas" w:eastAsia="Consolas" w:hAnsi="Consolas"/>
-          <w:sz w:val="18"/>
-          <w:szCs w:val="18"/>
-          <w:shd w:fill="EEF1F5" w:color="auto" w:val="clear"/>
-        </w:rPr>
-        <w:t xml:space="preserve">S3FileStorageService</w:t>
-      </w:r>
-      <w:r>
-        <w:t xml:space="preserve"> (MinIO locally).</w:t>
+        <w:t xml:space="preserve">Playwright smoke in CI against Compose.</w:t>
       </w:r>
     </w:p>
     <w:p>
@@ -16659,16 +18145,49 @@
         <w:spacing w:after="60"/>
       </w:pPr>
       <w:r>
+        <w:t xml:space="preserve">Keep adding </w:t>
+      </w:r>
+      <w:r>
         <w:rPr>
           <w:rFonts w:ascii="Consolas" w:cs="Consolas" w:eastAsia="Consolas" w:hAnsi="Consolas"/>
           <w:sz w:val="18"/>
           <w:szCs w:val="18"/>
           <w:shd w:fill="EEF1F5" w:color="auto" w:val="clear"/>
         </w:rPr>
-        <w:t xml:space="preserve">trade_version</w:t>
-      </w:r>
-      <w:r>
-        <w:t xml:space="preserve"> audit table, written on every lifecycle action; shown in the blotter's trade history.</w:t>
+        <w:t xml:space="preserve">@PreAuthorize</w:t>
+      </w:r>
+      <w:r>
+        <w:t xml:space="preserve"> permission checks to any new endpoint, so the S4 cut-over stays cheap.</w:t>
+      </w:r>
+    </w:p>
+    <w:p>
+      <w:pPr>
+        <w:spacing w:after="120"/>
+      </w:pPr>
+      <w:r>
+        <w:rPr>
+          <w:b/>
+          <w:bCs/>
+        </w:rPr>
+        <w:t xml:space="preserve">S2 — Extract </w:t>
+      </w:r>
+      <w:r>
+        <w:rPr>
+          <w:rFonts w:ascii="Consolas" w:cs="Consolas" w:eastAsia="Consolas" w:hAnsi="Consolas"/>
+          <w:b/>
+          <w:bCs/>
+          <w:sz w:val="18"/>
+          <w:szCs w:val="18"/>
+          <w:shd w:fill="EEF1F5" w:color="auto" w:val="clear"/>
+        </w:rPr>
+        <w:t xml:space="preserve">pricing-engine</w:t>
+      </w:r>
+      <w:r>
+        <w:rPr>
+          <w:b/>
+          <w:bCs/>
+        </w:rPr>
+        <w:t xml:space="preserve"> (26 Oct – 6 Nov)</w:t>
       </w:r>
     </w:p>
     <w:p>
@@ -16681,37 +18200,28 @@
         <w:spacing w:after="60"/>
       </w:pPr>
       <w:r>
-        <w:t xml:space="preserve">Playwright smoke in CI against Compose.</w:t>
-      </w:r>
-    </w:p>
-    <w:p>
-      <w:pPr>
-        <w:spacing w:after="120"/>
-      </w:pPr>
-      <w:r>
-        <w:rPr>
-          <w:b/>
-          <w:bCs/>
-        </w:rPr>
-        <w:t xml:space="preserve">S2 — Extract </w:t>
-      </w:r>
-      <w:r>
         <w:rPr>
           <w:rFonts w:ascii="Consolas" w:cs="Consolas" w:eastAsia="Consolas" w:hAnsi="Consolas"/>
-          <w:b/>
-          <w:bCs/>
           <w:sz w:val="18"/>
           <w:szCs w:val="18"/>
           <w:shd w:fill="EEF1F5" w:color="auto" w:val="clear"/>
         </w:rPr>
-        <w:t xml:space="preserve">pricing-engine</w:t>
+        <w:t xml:space="preserve">quant-lib</w:t>
+      </w:r>
+      <w:r>
+        <w:t xml:space="preserve"> module (pricing foundation, tools and calculators); </w:t>
       </w:r>
       <w:r>
         <w:rPr>
-          <w:b/>
-          <w:bCs/>
+          <w:rFonts w:ascii="Consolas" w:cs="Consolas" w:eastAsia="Consolas" w:hAnsi="Consolas"/>
+          <w:sz w:val="18"/>
+          <w:szCs w:val="18"/>
+          <w:shd w:fill="EEF1F5" w:color="auto" w:val="clear"/>
         </w:rPr>
-        <w:t xml:space="preserve"> (26 Oct – 6 Nov)</w:t>
+        <w:t xml:space="preserve">platform-common</w:t>
+      </w:r>
+      <w:r>
+        <w:t xml:space="preserve">.</w:t>
       </w:r>
     </w:p>
     <w:p>
@@ -16730,10 +18240,10 @@
           <w:szCs w:val="18"/>
           <w:shd w:fill="EEF1F5" w:color="auto" w:val="clear"/>
         </w:rPr>
-        <w:t xml:space="preserve">quant-lib</w:t>
-      </w:r>
-      <w:r>
-        <w:t xml:space="preserve"> module (pricing foundation, tools and calculators); </w:t>
+        <w:t xml:space="preserve">pricing-engine</w:t>
+      </w:r>
+      <w:r>
+        <w:t xml:space="preserve"> app: </w:t>
       </w:r>
       <w:r>
         <w:rPr>
@@ -16742,10 +18252,46 @@
           <w:szCs w:val="18"/>
           <w:shd w:fill="EEF1F5" w:color="auto" w:val="clear"/>
         </w:rPr>
-        <w:t xml:space="preserve">platform-common</w:t>
-      </w:r>
-      <w:r>
-        <w:t xml:space="preserve">.</w:t>
+        <w:t xml:space="preserve">PricingController</w:t>
+      </w:r>
+      <w:r>
+        <w:t xml:space="preserve">, the </w:t>
+      </w:r>
+      <w:r>
+        <w:rPr>
+          <w:rFonts w:ascii="Consolas" w:cs="Consolas" w:eastAsia="Consolas" w:hAnsi="Consolas"/>
+          <w:sz w:val="18"/>
+          <w:szCs w:val="18"/>
+          <w:shd w:fill="EEF1F5" w:color="auto" w:val="clear"/>
+        </w:rPr>
+        <w:t xml:space="preserve">TicketValuationManager</w:t>
+      </w:r>
+      <w:r>
+        <w:t xml:space="preserve">s, </w:t>
+      </w:r>
+      <w:r>
+        <w:rPr>
+          <w:rFonts w:ascii="Consolas" w:cs="Consolas" w:eastAsia="Consolas" w:hAnsi="Consolas"/>
+          <w:sz w:val="18"/>
+          <w:szCs w:val="18"/>
+          <w:shd w:fill="EEF1F5" w:color="auto" w:val="clear"/>
+        </w:rPr>
+        <w:t xml:space="preserve">RiskEngine*</w:t>
+      </w:r>
+      <w:r>
+        <w:t xml:space="preserve">, STOMP risk socket; market context from Redis, with a fallback to the </w:t>
+      </w:r>
+      <w:r>
+        <w:rPr>
+          <w:rFonts w:ascii="Consolas" w:cs="Consolas" w:eastAsia="Consolas" w:hAnsi="Consolas"/>
+          <w:sz w:val="18"/>
+          <w:szCs w:val="18"/>
+          <w:shd w:fill="EEF1F5" w:color="auto" w:val="clear"/>
+        </w:rPr>
+        <w:t xml:space="preserve">core-api</w:t>
+      </w:r>
+      <w:r>
+        <w:t xml:space="preserve"> internal endpoint.</w:t>
       </w:r>
     </w:p>
     <w:p>
@@ -16758,64 +18304,7 @@
         <w:spacing w:after="60"/>
       </w:pPr>
       <w:r>
-        <w:rPr>
-          <w:rFonts w:ascii="Consolas" w:cs="Consolas" w:eastAsia="Consolas" w:hAnsi="Consolas"/>
-          <w:sz w:val="18"/>
-          <w:szCs w:val="18"/>
-          <w:shd w:fill="EEF1F5" w:color="auto" w:val="clear"/>
-        </w:rPr>
-        <w:t xml:space="preserve">pricing-engine</w:t>
-      </w:r>
-      <w:r>
-        <w:t xml:space="preserve"> app: </w:t>
-      </w:r>
-      <w:r>
-        <w:rPr>
-          <w:rFonts w:ascii="Consolas" w:cs="Consolas" w:eastAsia="Consolas" w:hAnsi="Consolas"/>
-          <w:sz w:val="18"/>
-          <w:szCs w:val="18"/>
-          <w:shd w:fill="EEF1F5" w:color="auto" w:val="clear"/>
-        </w:rPr>
-        <w:t xml:space="preserve">PricingController</w:t>
-      </w:r>
-      <w:r>
-        <w:t xml:space="preserve">, the </w:t>
-      </w:r>
-      <w:r>
-        <w:rPr>
-          <w:rFonts w:ascii="Consolas" w:cs="Consolas" w:eastAsia="Consolas" w:hAnsi="Consolas"/>
-          <w:sz w:val="18"/>
-          <w:szCs w:val="18"/>
-          <w:shd w:fill="EEF1F5" w:color="auto" w:val="clear"/>
-        </w:rPr>
-        <w:t xml:space="preserve">TicketValuationManager</w:t>
-      </w:r>
-      <w:r>
-        <w:t xml:space="preserve">s, </w:t>
-      </w:r>
-      <w:r>
-        <w:rPr>
-          <w:rFonts w:ascii="Consolas" w:cs="Consolas" w:eastAsia="Consolas" w:hAnsi="Consolas"/>
-          <w:sz w:val="18"/>
-          <w:szCs w:val="18"/>
-          <w:shd w:fill="EEF1F5" w:color="auto" w:val="clear"/>
-        </w:rPr>
-        <w:t xml:space="preserve">RiskEngine*</w:t>
-      </w:r>
-      <w:r>
-        <w:t xml:space="preserve">, STOMP risk socket; market context from Redis, with a fallback to the </w:t>
-      </w:r>
-      <w:r>
-        <w:rPr>
-          <w:rFonts w:ascii="Consolas" w:cs="Consolas" w:eastAsia="Consolas" w:hAnsi="Consolas"/>
-          <w:sz w:val="18"/>
-          <w:szCs w:val="18"/>
-          <w:shd w:fill="EEF1F5" w:color="auto" w:val="clear"/>
-        </w:rPr>
-        <w:t xml:space="preserve">core-api</w:t>
-      </w:r>
-      <w:r>
-        <w:t xml:space="preserve"> internal endpoint.</w:t>
+        <w:t xml:space="preserve">nginx and ingress path routing; contract tests; generated Java client.</w:t>
       </w:r>
     </w:p>
     <w:p>
@@ -16828,7 +18317,7 @@
         <w:spacing w:after="60"/>
       </w:pPr>
       <w:r>
-        <w:t xml:space="preserve">nginx and ingress path routing; contract tests; generated Java client.</w:t>
+        <w:t xml:space="preserve">Golden-value tests for OIS, bond, deposit and FX forward.</w:t>
       </w:r>
     </w:p>
     <w:p>
@@ -16841,7 +18330,37 @@
         <w:spacing w:after="60"/>
       </w:pPr>
       <w:r>
-        <w:t xml:space="preserve">Golden-value tests for OIS, bond, deposit and FX forward.</w:t>
+        <w:t xml:space="preserve">Performance baseline for ticket valuation.</w:t>
+      </w:r>
+    </w:p>
+    <w:p>
+      <w:pPr>
+        <w:spacing w:after="120"/>
+      </w:pPr>
+      <w:r>
+        <w:rPr>
+          <w:b/>
+          <w:bCs/>
+        </w:rPr>
+        <w:t xml:space="preserve">S3 — </w:t>
+      </w:r>
+      <w:r>
+        <w:rPr>
+          <w:rFonts w:ascii="Consolas" w:cs="Consolas" w:eastAsia="Consolas" w:hAnsi="Consolas"/>
+          <w:b/>
+          <w:bCs/>
+          <w:sz w:val="18"/>
+          <w:szCs w:val="18"/>
+          <w:shd w:fill="EEF1F5" w:color="auto" w:val="clear"/>
+        </w:rPr>
+        <w:t xml:space="preserve">batch-reporting</w:t>
+      </w:r>
+      <w:r>
+        <w:rPr>
+          <w:b/>
+          <w:bCs/>
+        </w:rPr>
+        <w:t xml:space="preserve"> and real EOD (9 – 20 Nov)</w:t>
       </w:r>
     </w:p>
     <w:p>
@@ -16854,25 +18373,8 @@
         <w:spacing w:after="60"/>
       </w:pPr>
       <w:r>
-        <w:t xml:space="preserve">Performance baseline for ticket valuation.</w:t>
-      </w:r>
-    </w:p>
-    <w:p>
-      <w:pPr>
-        <w:spacing w:after="120"/>
-      </w:pPr>
-      <w:r>
-        <w:rPr>
-          <w:b/>
-          <w:bCs/>
-        </w:rPr>
-        <w:t xml:space="preserve">S3 — </w:t>
-      </w:r>
-      <w:r>
         <w:rPr>
           <w:rFonts w:ascii="Consolas" w:cs="Consolas" w:eastAsia="Consolas" w:hAnsi="Consolas"/>
-          <w:b/>
-          <w:bCs/>
           <w:sz w:val="18"/>
           <w:szCs w:val="18"/>
           <w:shd w:fill="EEF1F5" w:color="auto" w:val="clear"/>
@@ -16880,11 +18382,43 @@
         <w:t xml:space="preserve">batch-reporting</w:t>
       </w:r>
       <w:r>
+        <w:t xml:space="preserve"> app: </w:t>
+      </w:r>
+      <w:r>
         <w:rPr>
-          <w:b/>
-          <w:bCs/>
+          <w:rFonts w:ascii="Consolas" w:cs="Consolas" w:eastAsia="Consolas" w:hAnsi="Consolas"/>
+          <w:sz w:val="18"/>
+          <w:szCs w:val="18"/>
+          <w:shd w:fill="EEF1F5" w:color="auto" w:val="clear"/>
         </w:rPr>
-        <w:t xml:space="preserve"> and real EOD (9 – 20 Nov)</w:t>
+        <w:t xml:space="preserve">reporting/*</w:t>
+      </w:r>
+      <w:r>
+        <w:t xml:space="preserve">, </w:t>
+      </w:r>
+      <w:r>
+        <w:rPr>
+          <w:rFonts w:ascii="Consolas" w:cs="Consolas" w:eastAsia="Consolas" w:hAnsi="Consolas"/>
+          <w:sz w:val="18"/>
+          <w:szCs w:val="18"/>
+          <w:shd w:fill="EEF1F5" w:color="auto" w:val="clear"/>
+        </w:rPr>
+        <w:t xml:space="preserve">batch</w:t>
+      </w:r>
+      <w:r>
+        <w:t xml:space="preserve">; schema </w:t>
+      </w:r>
+      <w:r>
+        <w:rPr>
+          <w:rFonts w:ascii="Consolas" w:cs="Consolas" w:eastAsia="Consolas" w:hAnsi="Consolas"/>
+          <w:sz w:val="18"/>
+          <w:szCs w:val="18"/>
+          <w:shd w:fill="EEF1F5" w:color="auto" w:val="clear"/>
+        </w:rPr>
+        <w:t xml:space="preserve">reporting</w:t>
+      </w:r>
+      <w:r>
+        <w:t xml:space="preserve">.</w:t>
       </w:r>
     </w:p>
     <w:p>
@@ -16898,15 +18432,24 @@
       </w:pPr>
       <w:r>
         <w:rPr>
+          <w:b/>
+          <w:bCs/>
+        </w:rPr>
+        <w:t xml:space="preserve">Spring Batch </w:t>
+      </w:r>
+      <w:r>
+        <w:rPr>
           <w:rFonts w:ascii="Consolas" w:cs="Consolas" w:eastAsia="Consolas" w:hAnsi="Consolas"/>
+          <w:b/>
+          <w:bCs/>
           <w:sz w:val="18"/>
           <w:szCs w:val="18"/>
           <w:shd w:fill="EEF1F5" w:color="auto" w:val="clear"/>
         </w:rPr>
-        <w:t xml:space="preserve">batch-reporting</w:t>
-      </w:r>
-      <w:r>
-        <w:t xml:space="preserve"> app: </w:t>
+        <w:t xml:space="preserve">eodValuationJob</w:t>
+      </w:r>
+      <w:r>
+        <w:t xml:space="preserve"> (§4.7); </w:t>
       </w:r>
       <w:r>
         <w:rPr>
@@ -16915,10 +18458,10 @@
           <w:szCs w:val="18"/>
           <w:shd w:fill="EEF1F5" w:color="auto" w:val="clear"/>
         </w:rPr>
-        <w:t xml:space="preserve">reporting/*</w:t>
-      </w:r>
-      <w:r>
-        <w:t xml:space="preserve">, </w:t>
+        <w:t xml:space="preserve">eod_run</w:t>
+      </w:r>
+      <w:r>
+        <w:t xml:space="preserve">/</w:t>
       </w:r>
       <w:r>
         <w:rPr>
@@ -16927,10 +18470,10 @@
           <w:szCs w:val="18"/>
           <w:shd w:fill="EEF1F5" w:color="auto" w:val="clear"/>
         </w:rPr>
-        <w:t xml:space="preserve">batch</w:t>
-      </w:r>
-      <w:r>
-        <w:t xml:space="preserve">; schema </w:t>
+        <w:t xml:space="preserve">eod_valuation</w:t>
+      </w:r>
+      <w:r>
+        <w:t xml:space="preserve">/</w:t>
       </w:r>
       <w:r>
         <w:rPr>
@@ -16939,10 +18482,10 @@
           <w:szCs w:val="18"/>
           <w:shd w:fill="EEF1F5" w:color="auto" w:val="clear"/>
         </w:rPr>
-        <w:t xml:space="preserve">reporting</w:t>
-      </w:r>
-      <w:r>
-        <w:t xml:space="preserve">.</w:t>
+        <w:t xml:space="preserve">eod_cashflow</w:t>
+      </w:r>
+      <w:r>
+        <w:t xml:space="preserve">; SSE progress from job metadata; the Operations module wired to it.</w:t>
       </w:r>
     </w:p>
     <w:p>
@@ -16955,61 +18498,7 @@
         <w:spacing w:after="60"/>
       </w:pPr>
       <w:r>
-        <w:rPr>
-          <w:b/>
-          <w:bCs/>
-        </w:rPr>
-        <w:t xml:space="preserve">Spring Batch </w:t>
-      </w:r>
-      <w:r>
-        <w:rPr>
-          <w:rFonts w:ascii="Consolas" w:cs="Consolas" w:eastAsia="Consolas" w:hAnsi="Consolas"/>
-          <w:b/>
-          <w:bCs/>
-          <w:sz w:val="18"/>
-          <w:szCs w:val="18"/>
-          <w:shd w:fill="EEF1F5" w:color="auto" w:val="clear"/>
-        </w:rPr>
-        <w:t xml:space="preserve">eodValuationJob</w:t>
-      </w:r>
-      <w:r>
-        <w:t xml:space="preserve"> (§4.7); </w:t>
-      </w:r>
-      <w:r>
-        <w:rPr>
-          <w:rFonts w:ascii="Consolas" w:cs="Consolas" w:eastAsia="Consolas" w:hAnsi="Consolas"/>
-          <w:sz w:val="18"/>
-          <w:szCs w:val="18"/>
-          <w:shd w:fill="EEF1F5" w:color="auto" w:val="clear"/>
-        </w:rPr>
-        <w:t xml:space="preserve">eod_run</w:t>
-      </w:r>
-      <w:r>
-        <w:t xml:space="preserve">/</w:t>
-      </w:r>
-      <w:r>
-        <w:rPr>
-          <w:rFonts w:ascii="Consolas" w:cs="Consolas" w:eastAsia="Consolas" w:hAnsi="Consolas"/>
-          <w:sz w:val="18"/>
-          <w:szCs w:val="18"/>
-          <w:shd w:fill="EEF1F5" w:color="auto" w:val="clear"/>
-        </w:rPr>
-        <w:t xml:space="preserve">eod_valuation</w:t>
-      </w:r>
-      <w:r>
-        <w:t xml:space="preserve">/</w:t>
-      </w:r>
-      <w:r>
-        <w:rPr>
-          <w:rFonts w:ascii="Consolas" w:cs="Consolas" w:eastAsia="Consolas" w:hAnsi="Consolas"/>
-          <w:sz w:val="18"/>
-          <w:szCs w:val="18"/>
-          <w:shd w:fill="EEF1F5" w:color="auto" w:val="clear"/>
-        </w:rPr>
-        <w:t xml:space="preserve">eod_cashflow</w:t>
-      </w:r>
-      <w:r>
-        <w:t xml:space="preserve">; SSE progress from job metadata; the Operations module wired to it.</w:t>
+        <w:t xml:space="preserve">Report queries read from persisted EOD results; the dependency graph runs after EOD.</w:t>
       </w:r>
     </w:p>
     <w:p>
@@ -17022,7 +18511,19 @@
         <w:spacing w:after="60"/>
       </w:pPr>
       <w:r>
-        <w:t xml:space="preserve">Report queries read from persisted EOD results; the dependency graph runs after EOD.</w:t>
+        <w:t xml:space="preserve">Load test: EOD with 10k synthetic trades.</w:t>
+      </w:r>
+    </w:p>
+    <w:p>
+      <w:pPr>
+        <w:spacing w:after="120"/>
+      </w:pPr>
+      <w:r>
+        <w:rPr>
+          <w:b/>
+          <w:bCs/>
+        </w:rPr>
+        <w:t xml:space="preserve">S4 — Keycloak cut-over, AWS dev on EKS and UI pass (23 Nov – 4 Dec)</w:t>
       </w:r>
     </w:p>
     <w:p>
@@ -17035,19 +18536,50 @@
         <w:spacing w:after="60"/>
       </w:pPr>
       <w:r>
-        <w:t xml:space="preserve">Load test: EOD with 10k synthetic trades.</w:t>
-      </w:r>
-    </w:p>
-    <w:p>
-      <w:pPr>
-        <w:spacing w:after="120"/>
-      </w:pPr>
-      <w:r>
         <w:rPr>
           <w:b/>
           <w:bCs/>
         </w:rPr>
-        <w:t xml:space="preserve">S4 — AWS dev on EKS and UI pass (23 Nov – 4 Dec)</w:t>
+        <w:t xml:space="preserve">Keycloak cut-over:</w:t>
+      </w:r>
+      <w:r>
+        <w:t xml:space="preserve"> map Keycloak realm roles to the 20 RBAC roles and 60 permission codes; set </w:t>
+      </w:r>
+      <w:r>
+        <w:rPr>
+          <w:rFonts w:ascii="Consolas" w:cs="Consolas" w:eastAsia="Consolas" w:hAnsi="Consolas"/>
+          <w:sz w:val="18"/>
+          <w:szCs w:val="18"/>
+          <w:shd w:fill="EEF1F5" w:color="auto" w:val="clear"/>
+        </w:rPr>
+        <w:t xml:space="preserve">app.security.auth-bypass=false</w:t>
+      </w:r>
+      <w:r>
+        <w:t xml:space="preserve"> on AWS dev, then the pilot environment; dev login only under </w:t>
+      </w:r>
+      <w:r>
+        <w:rPr>
+          <w:rFonts w:ascii="Consolas" w:cs="Consolas" w:eastAsia="Consolas" w:hAnsi="Consolas"/>
+          <w:sz w:val="18"/>
+          <w:szCs w:val="18"/>
+          <w:shd w:fill="EEF1F5" w:color="auto" w:val="clear"/>
+        </w:rPr>
+        <w:t xml:space="preserve">local</w:t>
+      </w:r>
+      <w:r>
+        <w:t xml:space="preserve">/</w:t>
+      </w:r>
+      <w:r>
+        <w:rPr>
+          <w:rFonts w:ascii="Consolas" w:cs="Consolas" w:eastAsia="Consolas" w:hAnsi="Consolas"/>
+          <w:sz w:val="18"/>
+          <w:szCs w:val="18"/>
+          <w:shd w:fill="EEF1F5" w:color="auto" w:val="clear"/>
+        </w:rPr>
+        <w:t xml:space="preserve">preview</w:t>
+      </w:r>
+      <w:r>
+        <w:t xml:space="preserve">; authorisation tests per endpoint and role; Playwright login flow.</w:t>
       </w:r>
     </w:p>
     <w:p>
@@ -17235,7 +18767,29 @@
         <w:t xml:space="preserve">aws-pilot</w:t>
       </w:r>
       <w:r>
-        <w:t xml:space="preserve"> environment provisioned (Multi-AZ RDS, 2+ replicas), empty.</w:t>
+        <w:t xml:space="preserve"> environment provisioned (Multi-AZ RDS, 2+ replicas), empty, </w:t>
+      </w:r>
+      <w:r>
+        <w:rPr>
+          <w:b/>
+          <w:bCs/>
+        </w:rPr>
+        <w:t xml:space="preserve">with authentication on</w:t>
+      </w:r>
+      <w:r>
+        <w:t xml:space="preserve"> (</w:t>
+      </w:r>
+      <w:r>
+        <w:rPr>
+          <w:rFonts w:ascii="Consolas" w:cs="Consolas" w:eastAsia="Consolas" w:hAnsi="Consolas"/>
+          <w:sz w:val="18"/>
+          <w:szCs w:val="18"/>
+          <w:shd w:fill="EEF1F5" w:color="auto" w:val="clear"/>
+        </w:rPr>
+        <w:t xml:space="preserve">app.security.auth-bypass=false</w:t>
+      </w:r>
+      <w:r>
+        <w:t xml:space="preserve">).</w:t>
       </w:r>
     </w:p>
     <w:p>
@@ -18109,7 +19663,7 @@
         <w:t xml:space="preserve">Never cut</w:t>
       </w:r>
       <w:r>
-        <w:t xml:space="preserve"> G1–G5 (auth, state, EOD, migrations, storage), tests or security gates.</w:t>
+        <w:t xml:space="preserve"> G1–G5 (auth, state, EOD, migrations, storage), tests or security gates. The Keycloak cut-over (G1) may move from S4 into S5, but never past the pilot start.</w:t>
       </w:r>
     </w:p>
     <w:p>
@@ -20181,9 +21735,9 @@
         <w:tblLayout w:type="fixed"/>
       </w:tblPr>
       <w:tblGrid>
-        <w:gridCol w:w="3500"/>
+        <w:gridCol w:w="3455"/>
         <w:gridCol w:w="1023"/>
-        <w:gridCol w:w="5115"/>
+        <w:gridCol w:w="5160"/>
       </w:tblGrid>
       <w:tr>
         <w:trPr>
@@ -20192,7 +21746,7 @@
         </w:trPr>
         <w:tc>
           <w:tcPr>
-            <w:tcW w:type="dxa" w:w="3500"/>
+            <w:tcW w:type="dxa" w:w="3455"/>
             <w:tcBorders>
               <w:top w:val="single" w:color="B7C3D3" w:sz="4"/>
               <w:left w:val="single" w:color="B7C3D3" w:sz="4"/>
@@ -20260,7 +21814,7 @@
         </w:tc>
         <w:tc>
           <w:tcPr>
-            <w:tcW w:type="dxa" w:w="5115"/>
+            <w:tcW w:type="dxa" w:w="5160"/>
             <w:tcBorders>
               <w:top w:val="single" w:color="B7C3D3" w:sz="4"/>
               <w:left w:val="single" w:color="B7C3D3" w:sz="4"/>
@@ -20299,7 +21853,7 @@
         </w:trPr>
         <w:tc>
           <w:tcPr>
-            <w:tcW w:type="dxa" w:w="3500"/>
+            <w:tcW w:type="dxa" w:w="3455"/>
             <w:tcBorders>
               <w:top w:val="single" w:color="B7C3D3" w:sz="4"/>
               <w:left w:val="single" w:color="B7C3D3" w:sz="4"/>
@@ -20359,31 +21913,31 @@
         </w:tc>
         <w:tc>
           <w:tcPr>
-            <w:tcW w:type="dxa" w:w="5115"/>
-            <w:tcBorders>
-              <w:top w:val="single" w:color="B7C3D3" w:sz="4"/>
-              <w:left w:val="single" w:color="B7C3D3" w:sz="4"/>
-              <w:bottom w:val="single" w:color="B7C3D3" w:sz="4"/>
-              <w:right w:val="single" w:color="B7C3D3" w:sz="4"/>
-            </w:tcBorders>
-            <w:tcMar>
-              <w:top w:type="dxa" w:w="60"/>
-              <w:left w:type="dxa" w:w="100"/>
-              <w:bottom w:type="dxa" w:w="60"/>
-              <w:right w:type="dxa" w:w="100"/>
-            </w:tcMar>
-          </w:tcPr>
-          <w:p>
-            <w:pPr>
-              <w:spacing w:after="0" w:before="0"/>
-              <w:jc w:val="left"/>
-            </w:pPr>
-            <w:r>
-              <w:rPr>
-                <w:sz w:val="18"/>
-                <w:szCs w:val="18"/>
-              </w:rPr>
-              <w:t xml:space="preserve">S1 authorisation test suite; Playwright on previews; roles mapped 1:1 to existing permission codes</w:t>
+            <w:tcW w:type="dxa" w:w="5160"/>
+            <w:tcBorders>
+              <w:top w:val="single" w:color="B7C3D3" w:sz="4"/>
+              <w:left w:val="single" w:color="B7C3D3" w:sz="4"/>
+              <w:bottom w:val="single" w:color="B7C3D3" w:sz="4"/>
+              <w:right w:val="single" w:color="B7C3D3" w:sz="4"/>
+            </w:tcBorders>
+            <w:tcMar>
+              <w:top w:type="dxa" w:w="60"/>
+              <w:left w:type="dxa" w:w="100"/>
+              <w:bottom w:type="dxa" w:w="60"/>
+              <w:right w:type="dxa" w:w="100"/>
+            </w:tcMar>
+          </w:tcPr>
+          <w:p>
+            <w:pPr>
+              <w:spacing w:after="0" w:before="0"/>
+              <w:jc w:val="left"/>
+            </w:pPr>
+            <w:r>
+              <w:rPr>
+                <w:sz w:val="18"/>
+                <w:szCs w:val="18"/>
+              </w:rPr>
+              <w:t xml:space="preserve">Cut-over in S4 behind a per-environment setting (AWS dev first, previews can stay bypassed); authorisation test suite; Playwright login flow; roles mapped 1:1 to existing permission codes</w:t>
             </w:r>
           </w:p>
         </w:tc>
@@ -20394,7 +21948,7 @@
         </w:trPr>
         <w:tc>
           <w:tcPr>
-            <w:tcW w:type="dxa" w:w="3500"/>
+            <w:tcW w:type="dxa" w:w="3455"/>
             <w:tcBorders>
               <w:top w:val="single" w:color="B7C3D3" w:sz="4"/>
               <w:left w:val="single" w:color="B7C3D3" w:sz="4"/>
@@ -20419,7 +21973,69 @@
                 <w:sz w:val="18"/>
                 <w:szCs w:val="18"/>
               </w:rPr>
-              <w:t xml:space="preserve">Pricing regressions from moving code into </w:t>
+              <w:t xml:space="preserve">Auth cut-over slips past S4</w:t>
+            </w:r>
+          </w:p>
+        </w:tc>
+        <w:tc>
+          <w:tcPr>
+            <w:tcW w:type="dxa" w:w="1023"/>
+            <w:tcBorders>
+              <w:top w:val="single" w:color="B7C3D3" w:sz="4"/>
+              <w:left w:val="single" w:color="B7C3D3" w:sz="4"/>
+              <w:bottom w:val="single" w:color="B7C3D3" w:sz="4"/>
+              <w:right w:val="single" w:color="B7C3D3" w:sz="4"/>
+            </w:tcBorders>
+            <w:shd w:fill="F3F6FA" w:color="auto" w:val="clear"/>
+            <w:tcMar>
+              <w:top w:type="dxa" w:w="60"/>
+              <w:left w:type="dxa" w:w="100"/>
+              <w:bottom w:type="dxa" w:w="60"/>
+              <w:right w:type="dxa" w:w="100"/>
+            </w:tcMar>
+          </w:tcPr>
+          <w:p>
+            <w:pPr>
+              <w:spacing w:after="0" w:before="0"/>
+              <w:jc w:val="left"/>
+            </w:pPr>
+            <w:r>
+              <w:rPr>
+                <w:sz w:val="18"/>
+                <w:szCs w:val="18"/>
+              </w:rPr>
+              <w:t xml:space="preserve">High</w:t>
+            </w:r>
+          </w:p>
+        </w:tc>
+        <w:tc>
+          <w:tcPr>
+            <w:tcW w:type="dxa" w:w="5160"/>
+            <w:tcBorders>
+              <w:top w:val="single" w:color="B7C3D3" w:sz="4"/>
+              <w:left w:val="single" w:color="B7C3D3" w:sz="4"/>
+              <w:bottom w:val="single" w:color="B7C3D3" w:sz="4"/>
+              <w:right w:val="single" w:color="B7C3D3" w:sz="4"/>
+            </w:tcBorders>
+            <w:shd w:fill="F3F6FA" w:color="auto" w:val="clear"/>
+            <w:tcMar>
+              <w:top w:type="dxa" w:w="60"/>
+              <w:left w:type="dxa" w:w="100"/>
+              <w:bottom w:type="dxa" w:w="60"/>
+              <w:right w:type="dxa" w:w="100"/>
+            </w:tcMar>
+          </w:tcPr>
+          <w:p>
+            <w:pPr>
+              <w:spacing w:after="0" w:before="0"/>
+              <w:jc w:val="left"/>
+            </w:pPr>
+            <w:r>
+              <w:rPr>
+                <w:sz w:val="18"/>
+                <w:szCs w:val="18"/>
+              </w:rPr>
+              <w:t xml:space="preserve">It is a pilot gate: no client data until </w:t>
             </w:r>
             <w:r>
               <w:rPr>
@@ -20428,85 +22044,14 @@
                 <w:szCs w:val="16"/>
                 <w:shd w:fill="EEF1F5" w:color="auto" w:val="clear"/>
               </w:rPr>
-              <w:t xml:space="preserve">quant-lib</w:t>
-            </w:r>
-            <w:r>
-              <w:rPr>
-                <w:sz w:val="18"/>
-                <w:szCs w:val="18"/>
-              </w:rPr>
-              <w:t xml:space="preserve"> / </w:t>
-            </w:r>
-            <w:r>
-              <w:rPr>
-                <w:rFonts w:ascii="Consolas" w:cs="Consolas" w:eastAsia="Consolas" w:hAnsi="Consolas"/>
-                <w:sz w:val="16"/>
-                <w:szCs w:val="16"/>
-                <w:shd w:fill="EEF1F5" w:color="auto" w:val="clear"/>
-              </w:rPr>
-              <w:t xml:space="preserve">pricing-engine</w:t>
-            </w:r>
-          </w:p>
-        </w:tc>
-        <w:tc>
-          <w:tcPr>
-            <w:tcW w:type="dxa" w:w="1023"/>
-            <w:tcBorders>
-              <w:top w:val="single" w:color="B7C3D3" w:sz="4"/>
-              <w:left w:val="single" w:color="B7C3D3" w:sz="4"/>
-              <w:bottom w:val="single" w:color="B7C3D3" w:sz="4"/>
-              <w:right w:val="single" w:color="B7C3D3" w:sz="4"/>
-            </w:tcBorders>
-            <w:shd w:fill="F3F6FA" w:color="auto" w:val="clear"/>
-            <w:tcMar>
-              <w:top w:type="dxa" w:w="60"/>
-              <w:left w:type="dxa" w:w="100"/>
-              <w:bottom w:type="dxa" w:w="60"/>
-              <w:right w:type="dxa" w:w="100"/>
-            </w:tcMar>
-          </w:tcPr>
-          <w:p>
-            <w:pPr>
-              <w:spacing w:after="0" w:before="0"/>
-              <w:jc w:val="left"/>
-            </w:pPr>
-            <w:r>
-              <w:rPr>
-                <w:sz w:val="18"/>
-                <w:szCs w:val="18"/>
-              </w:rPr>
-              <w:t xml:space="preserve">High</w:t>
-            </w:r>
-          </w:p>
-        </w:tc>
-        <w:tc>
-          <w:tcPr>
-            <w:tcW w:type="dxa" w:w="5115"/>
-            <w:tcBorders>
-              <w:top w:val="single" w:color="B7C3D3" w:sz="4"/>
-              <w:left w:val="single" w:color="B7C3D3" w:sz="4"/>
-              <w:bottom w:val="single" w:color="B7C3D3" w:sz="4"/>
-              <w:right w:val="single" w:color="B7C3D3" w:sz="4"/>
-            </w:tcBorders>
-            <w:shd w:fill="F3F6FA" w:color="auto" w:val="clear"/>
-            <w:tcMar>
-              <w:top w:type="dxa" w:w="60"/>
-              <w:left w:type="dxa" w:w="100"/>
-              <w:bottom w:type="dxa" w:w="60"/>
-              <w:right w:type="dxa" w:w="100"/>
-            </w:tcMar>
-          </w:tcPr>
-          <w:p>
-            <w:pPr>
-              <w:spacing w:after="0" w:before="0"/>
-              <w:jc w:val="left"/>
-            </w:pPr>
-            <w:r>
-              <w:rPr>
-                <w:sz w:val="18"/>
-                <w:szCs w:val="18"/>
-              </w:rPr>
-              <w:t xml:space="preserve">Behaviour-preserving moves; before/after regression suite on all 17 product types; golden tests</w:t>
+              <w:t xml:space="preserve">auth-bypass=false</w:t>
+            </w:r>
+            <w:r>
+              <w:rPr>
+                <w:sz w:val="18"/>
+                <w:szCs w:val="18"/>
+              </w:rPr>
+              <w:t xml:space="preserve"> on the pilot environment. S5 is the buffer</w:t>
             </w:r>
           </w:p>
         </w:tc>
@@ -20517,31 +22062,56 @@
         </w:trPr>
         <w:tc>
           <w:tcPr>
-            <w:tcW w:type="dxa" w:w="3500"/>
-            <w:tcBorders>
-              <w:top w:val="single" w:color="B7C3D3" w:sz="4"/>
-              <w:left w:val="single" w:color="B7C3D3" w:sz="4"/>
-              <w:bottom w:val="single" w:color="B7C3D3" w:sz="4"/>
-              <w:right w:val="single" w:color="B7C3D3" w:sz="4"/>
-            </w:tcBorders>
-            <w:tcMar>
-              <w:top w:type="dxa" w:w="60"/>
-              <w:left w:type="dxa" w:w="100"/>
-              <w:bottom w:type="dxa" w:w="60"/>
-              <w:right w:type="dxa" w:w="100"/>
-            </w:tcMar>
-          </w:tcPr>
-          <w:p>
-            <w:pPr>
-              <w:spacing w:after="0" w:before="0"/>
-              <w:jc w:val="left"/>
-            </w:pPr>
-            <w:r>
-              <w:rPr>
-                <w:sz w:val="18"/>
-                <w:szCs w:val="18"/>
-              </w:rPr>
-              <w:t xml:space="preserve">Flyway baseline differs from live databases</w:t>
+            <w:tcW w:type="dxa" w:w="3455"/>
+            <w:tcBorders>
+              <w:top w:val="single" w:color="B7C3D3" w:sz="4"/>
+              <w:left w:val="single" w:color="B7C3D3" w:sz="4"/>
+              <w:bottom w:val="single" w:color="B7C3D3" w:sz="4"/>
+              <w:right w:val="single" w:color="B7C3D3" w:sz="4"/>
+            </w:tcBorders>
+            <w:tcMar>
+              <w:top w:type="dxa" w:w="60"/>
+              <w:left w:type="dxa" w:w="100"/>
+              <w:bottom w:type="dxa" w:w="60"/>
+              <w:right w:type="dxa" w:w="100"/>
+            </w:tcMar>
+          </w:tcPr>
+          <w:p>
+            <w:pPr>
+              <w:spacing w:after="0" w:before="0"/>
+              <w:jc w:val="left"/>
+            </w:pPr>
+            <w:r>
+              <w:rPr>
+                <w:sz w:val="18"/>
+                <w:szCs w:val="18"/>
+              </w:rPr>
+              <w:t xml:space="preserve">Pricing regressions from moving code into </w:t>
+            </w:r>
+            <w:r>
+              <w:rPr>
+                <w:rFonts w:ascii="Consolas" w:cs="Consolas" w:eastAsia="Consolas" w:hAnsi="Consolas"/>
+                <w:sz w:val="16"/>
+                <w:szCs w:val="16"/>
+                <w:shd w:fill="EEF1F5" w:color="auto" w:val="clear"/>
+              </w:rPr>
+              <w:t xml:space="preserve">quant-lib</w:t>
+            </w:r>
+            <w:r>
+              <w:rPr>
+                <w:sz w:val="18"/>
+                <w:szCs w:val="18"/>
+              </w:rPr>
+              <w:t xml:space="preserve"> / </w:t>
+            </w:r>
+            <w:r>
+              <w:rPr>
+                <w:rFonts w:ascii="Consolas" w:cs="Consolas" w:eastAsia="Consolas" w:hAnsi="Consolas"/>
+                <w:sz w:val="16"/>
+                <w:szCs w:val="16"/>
+                <w:shd w:fill="EEF1F5" w:color="auto" w:val="clear"/>
+              </w:rPr>
+              <w:t xml:space="preserve">pricing-engine</w:t>
             </w:r>
           </w:p>
         </w:tc>
@@ -20571,53 +22141,37 @@
                 <w:sz w:val="18"/>
                 <w:szCs w:val="18"/>
               </w:rPr>
-              <w:t xml:space="preserve">Medium</w:t>
-            </w:r>
-          </w:p>
-        </w:tc>
-        <w:tc>
-          <w:tcPr>
-            <w:tcW w:type="dxa" w:w="5115"/>
-            <w:tcBorders>
-              <w:top w:val="single" w:color="B7C3D3" w:sz="4"/>
-              <w:left w:val="single" w:color="B7C3D3" w:sz="4"/>
-              <w:bottom w:val="single" w:color="B7C3D3" w:sz="4"/>
-              <w:right w:val="single" w:color="B7C3D3" w:sz="4"/>
-            </w:tcBorders>
-            <w:tcMar>
-              <w:top w:type="dxa" w:w="60"/>
-              <w:left w:type="dxa" w:w="100"/>
-              <w:bottom w:type="dxa" w:w="60"/>
-              <w:right w:type="dxa" w:w="100"/>
-            </w:tcMar>
-          </w:tcPr>
-          <w:p>
-            <w:pPr>
-              <w:spacing w:after="0" w:before="0"/>
-              <w:jc w:val="left"/>
-            </w:pPr>
-            <w:r>
-              <w:rPr>
-                <w:sz w:val="18"/>
-                <w:szCs w:val="18"/>
-              </w:rPr>
-              <w:t xml:space="preserve">Generate from Hibernate, diff against dev/prod with </w:t>
-            </w:r>
-            <w:r>
-              <w:rPr>
-                <w:rFonts w:ascii="Consolas" w:cs="Consolas" w:eastAsia="Consolas" w:hAnsi="Consolas"/>
-                <w:sz w:val="16"/>
-                <w:szCs w:val="16"/>
-                <w:shd w:fill="EEF1F5" w:color="auto" w:val="clear"/>
-              </w:rPr>
-              <w:t xml:space="preserve">pg_dump --schema-only</w:t>
-            </w:r>
-            <w:r>
-              <w:rPr>
-                <w:sz w:val="18"/>
-                <w:szCs w:val="18"/>
-              </w:rPr>
-              <w:t xml:space="preserve">, dry-run on copies</w:t>
+              <w:t xml:space="preserve">High</w:t>
+            </w:r>
+          </w:p>
+        </w:tc>
+        <w:tc>
+          <w:tcPr>
+            <w:tcW w:type="dxa" w:w="5160"/>
+            <w:tcBorders>
+              <w:top w:val="single" w:color="B7C3D3" w:sz="4"/>
+              <w:left w:val="single" w:color="B7C3D3" w:sz="4"/>
+              <w:bottom w:val="single" w:color="B7C3D3" w:sz="4"/>
+              <w:right w:val="single" w:color="B7C3D3" w:sz="4"/>
+            </w:tcBorders>
+            <w:tcMar>
+              <w:top w:type="dxa" w:w="60"/>
+              <w:left w:type="dxa" w:w="100"/>
+              <w:bottom w:type="dxa" w:w="60"/>
+              <w:right w:type="dxa" w:w="100"/>
+            </w:tcMar>
+          </w:tcPr>
+          <w:p>
+            <w:pPr>
+              <w:spacing w:after="0" w:before="0"/>
+              <w:jc w:val="left"/>
+            </w:pPr>
+            <w:r>
+              <w:rPr>
+                <w:sz w:val="18"/>
+                <w:szCs w:val="18"/>
+              </w:rPr>
+              <w:t xml:space="preserve">Behaviour-preserving moves; before/after regression suite on all 17 product types; golden tests</w:t>
             </w:r>
           </w:p>
         </w:tc>
@@ -20628,7 +22182,7 @@
         </w:trPr>
         <w:tc>
           <w:tcPr>
-            <w:tcW w:type="dxa" w:w="3500"/>
+            <w:tcW w:type="dxa" w:w="3455"/>
             <w:tcBorders>
               <w:top w:val="single" w:color="B7C3D3" w:sz="4"/>
               <w:left w:val="single" w:color="B7C3D3" w:sz="4"/>
@@ -20653,7 +22207,7 @@
                 <w:sz w:val="18"/>
                 <w:szCs w:val="18"/>
               </w:rPr>
-              <w:t xml:space="preserve">AWS platform work (EKS, IAM, networking) in 2 weeks</w:t>
+              <w:t xml:space="preserve">Flyway baseline differs from live databases</w:t>
             </w:r>
           </w:p>
         </w:tc>
@@ -20690,7 +22244,7 @@
         </w:tc>
         <w:tc>
           <w:tcPr>
-            <w:tcW w:type="dxa" w:w="5115"/>
+            <w:tcW w:type="dxa" w:w="5160"/>
             <w:tcBorders>
               <w:top w:val="single" w:color="B7C3D3" w:sz="4"/>
               <w:left w:val="single" w:color="B7C3D3" w:sz="4"/>
@@ -20715,7 +22269,23 @@
                 <w:sz w:val="18"/>
                 <w:szCs w:val="18"/>
               </w:rPr>
-              <w:t xml:space="preserve">Terraform modules from S0 in parallel by DevOps; the cut rule in §8.4 moves EKS to January without blocking the MVP</w:t>
+              <w:t xml:space="preserve">Generate from Hibernate, diff against dev/prod with </w:t>
+            </w:r>
+            <w:r>
+              <w:rPr>
+                <w:rFonts w:ascii="Consolas" w:cs="Consolas" w:eastAsia="Consolas" w:hAnsi="Consolas"/>
+                <w:sz w:val="16"/>
+                <w:szCs w:val="16"/>
+                <w:shd w:fill="EEF1F5" w:color="auto" w:val="clear"/>
+              </w:rPr>
+              <w:t xml:space="preserve">pg_dump --schema-only</w:t>
+            </w:r>
+            <w:r>
+              <w:rPr>
+                <w:sz w:val="18"/>
+                <w:szCs w:val="18"/>
+              </w:rPr>
+              <w:t xml:space="preserve">, dry-run on copies</w:t>
             </w:r>
           </w:p>
         </w:tc>
@@ -20726,31 +22296,31 @@
         </w:trPr>
         <w:tc>
           <w:tcPr>
-            <w:tcW w:type="dxa" w:w="3500"/>
-            <w:tcBorders>
-              <w:top w:val="single" w:color="B7C3D3" w:sz="4"/>
-              <w:left w:val="single" w:color="B7C3D3" w:sz="4"/>
-              <w:bottom w:val="single" w:color="B7C3D3" w:sz="4"/>
-              <w:right w:val="single" w:color="B7C3D3" w:sz="4"/>
-            </w:tcBorders>
-            <w:tcMar>
-              <w:top w:type="dxa" w:w="60"/>
-              <w:left w:type="dxa" w:w="100"/>
-              <w:bottom w:type="dxa" w:w="60"/>
-              <w:right w:type="dxa" w:w="100"/>
-            </w:tcMar>
-          </w:tcPr>
-          <w:p>
-            <w:pPr>
-              <w:spacing w:after="0" w:before="0"/>
-              <w:jc w:val="left"/>
-            </w:pPr>
-            <w:r>
-              <w:rPr>
-                <w:sz w:val="18"/>
-                <w:szCs w:val="18"/>
-              </w:rPr>
-              <w:t xml:space="preserve">Two platforms (RKE2 + AWS) to run</w:t>
+            <w:tcW w:type="dxa" w:w="3455"/>
+            <w:tcBorders>
+              <w:top w:val="single" w:color="B7C3D3" w:sz="4"/>
+              <w:left w:val="single" w:color="B7C3D3" w:sz="4"/>
+              <w:bottom w:val="single" w:color="B7C3D3" w:sz="4"/>
+              <w:right w:val="single" w:color="B7C3D3" w:sz="4"/>
+            </w:tcBorders>
+            <w:tcMar>
+              <w:top w:type="dxa" w:w="60"/>
+              <w:left w:type="dxa" w:w="100"/>
+              <w:bottom w:type="dxa" w:w="60"/>
+              <w:right w:type="dxa" w:w="100"/>
+            </w:tcMar>
+          </w:tcPr>
+          <w:p>
+            <w:pPr>
+              <w:spacing w:after="0" w:before="0"/>
+              <w:jc w:val="left"/>
+            </w:pPr>
+            <w:r>
+              <w:rPr>
+                <w:sz w:val="18"/>
+                <w:szCs w:val="18"/>
+              </w:rPr>
+              <w:t xml:space="preserve">AWS platform work (EKS, IAM, networking) in 2 weeks</w:t>
             </w:r>
           </w:p>
         </w:tc>
@@ -20786,31 +22356,31 @@
         </w:tc>
         <w:tc>
           <w:tcPr>
-            <w:tcW w:type="dxa" w:w="5115"/>
-            <w:tcBorders>
-              <w:top w:val="single" w:color="B7C3D3" w:sz="4"/>
-              <w:left w:val="single" w:color="B7C3D3" w:sz="4"/>
-              <w:bottom w:val="single" w:color="B7C3D3" w:sz="4"/>
-              <w:right w:val="single" w:color="B7C3D3" w:sz="4"/>
-            </w:tcBorders>
-            <w:tcMar>
-              <w:top w:type="dxa" w:w="60"/>
-              <w:left w:type="dxa" w:w="100"/>
-              <w:bottom w:type="dxa" w:w="60"/>
-              <w:right w:type="dxa" w:w="100"/>
-            </w:tcMar>
-          </w:tcPr>
-          <w:p>
-            <w:pPr>
-              <w:spacing w:after="0" w:before="0"/>
-              <w:jc w:val="left"/>
-            </w:pPr>
-            <w:r>
-              <w:rPr>
-                <w:sz w:val="18"/>
-                <w:szCs w:val="18"/>
-              </w:rPr>
-              <w:t xml:space="preserve">Same manifests (base + overlays); decide the production target at pilot exit (D4)</w:t>
+            <w:tcW w:type="dxa" w:w="5160"/>
+            <w:tcBorders>
+              <w:top w:val="single" w:color="B7C3D3" w:sz="4"/>
+              <w:left w:val="single" w:color="B7C3D3" w:sz="4"/>
+              <w:bottom w:val="single" w:color="B7C3D3" w:sz="4"/>
+              <w:right w:val="single" w:color="B7C3D3" w:sz="4"/>
+            </w:tcBorders>
+            <w:tcMar>
+              <w:top w:type="dxa" w:w="60"/>
+              <w:left w:type="dxa" w:w="100"/>
+              <w:bottom w:type="dxa" w:w="60"/>
+              <w:right w:type="dxa" w:w="100"/>
+            </w:tcMar>
+          </w:tcPr>
+          <w:p>
+            <w:pPr>
+              <w:spacing w:after="0" w:before="0"/>
+              <w:jc w:val="left"/>
+            </w:pPr>
+            <w:r>
+              <w:rPr>
+                <w:sz w:val="18"/>
+                <w:szCs w:val="18"/>
+              </w:rPr>
+              <w:t xml:space="preserve">Terraform modules from S0 in parallel by DevOps; the cut rule in §8.4 moves EKS to January without blocking the MVP</w:t>
             </w:r>
           </w:p>
         </w:tc>
@@ -20821,7 +22391,7 @@
         </w:trPr>
         <w:tc>
           <w:tcPr>
-            <w:tcW w:type="dxa" w:w="3500"/>
+            <w:tcW w:type="dxa" w:w="3455"/>
             <w:tcBorders>
               <w:top w:val="single" w:color="B7C3D3" w:sz="4"/>
               <w:left w:val="single" w:color="B7C3D3" w:sz="4"/>
@@ -20846,6 +22416,103 @@
                 <w:sz w:val="18"/>
                 <w:szCs w:val="18"/>
               </w:rPr>
+              <w:t xml:space="preserve">Two platforms (RKE2 + AWS) to run</w:t>
+            </w:r>
+          </w:p>
+        </w:tc>
+        <w:tc>
+          <w:tcPr>
+            <w:tcW w:type="dxa" w:w="1023"/>
+            <w:tcBorders>
+              <w:top w:val="single" w:color="B7C3D3" w:sz="4"/>
+              <w:left w:val="single" w:color="B7C3D3" w:sz="4"/>
+              <w:bottom w:val="single" w:color="B7C3D3" w:sz="4"/>
+              <w:right w:val="single" w:color="B7C3D3" w:sz="4"/>
+            </w:tcBorders>
+            <w:shd w:fill="F3F6FA" w:color="auto" w:val="clear"/>
+            <w:tcMar>
+              <w:top w:type="dxa" w:w="60"/>
+              <w:left w:type="dxa" w:w="100"/>
+              <w:bottom w:type="dxa" w:w="60"/>
+              <w:right w:type="dxa" w:w="100"/>
+            </w:tcMar>
+          </w:tcPr>
+          <w:p>
+            <w:pPr>
+              <w:spacing w:after="0" w:before="0"/>
+              <w:jc w:val="left"/>
+            </w:pPr>
+            <w:r>
+              <w:rPr>
+                <w:sz w:val="18"/>
+                <w:szCs w:val="18"/>
+              </w:rPr>
+              <w:t xml:space="preserve">Medium</w:t>
+            </w:r>
+          </w:p>
+        </w:tc>
+        <w:tc>
+          <w:tcPr>
+            <w:tcW w:type="dxa" w:w="5160"/>
+            <w:tcBorders>
+              <w:top w:val="single" w:color="B7C3D3" w:sz="4"/>
+              <w:left w:val="single" w:color="B7C3D3" w:sz="4"/>
+              <w:bottom w:val="single" w:color="B7C3D3" w:sz="4"/>
+              <w:right w:val="single" w:color="B7C3D3" w:sz="4"/>
+            </w:tcBorders>
+            <w:shd w:fill="F3F6FA" w:color="auto" w:val="clear"/>
+            <w:tcMar>
+              <w:top w:type="dxa" w:w="60"/>
+              <w:left w:type="dxa" w:w="100"/>
+              <w:bottom w:type="dxa" w:w="60"/>
+              <w:right w:type="dxa" w:w="100"/>
+            </w:tcMar>
+          </w:tcPr>
+          <w:p>
+            <w:pPr>
+              <w:spacing w:after="0" w:before="0"/>
+              <w:jc w:val="left"/>
+            </w:pPr>
+            <w:r>
+              <w:rPr>
+                <w:sz w:val="18"/>
+                <w:szCs w:val="18"/>
+              </w:rPr>
+              <w:t xml:space="preserve">Same manifests (base + overlays); decide the production target at pilot exit (D4)</w:t>
+            </w:r>
+          </w:p>
+        </w:tc>
+      </w:tr>
+      <w:tr>
+        <w:trPr>
+          <w:cantSplit/>
+        </w:trPr>
+        <w:tc>
+          <w:tcPr>
+            <w:tcW w:type="dxa" w:w="3455"/>
+            <w:tcBorders>
+              <w:top w:val="single" w:color="B7C3D3" w:sz="4"/>
+              <w:left w:val="single" w:color="B7C3D3" w:sz="4"/>
+              <w:bottom w:val="single" w:color="B7C3D3" w:sz="4"/>
+              <w:right w:val="single" w:color="B7C3D3" w:sz="4"/>
+            </w:tcBorders>
+            <w:tcMar>
+              <w:top w:type="dxa" w:w="60"/>
+              <w:left w:type="dxa" w:w="100"/>
+              <w:bottom w:type="dxa" w:w="60"/>
+              <w:right w:type="dxa" w:w="100"/>
+            </w:tcMar>
+          </w:tcPr>
+          <w:p>
+            <w:pPr>
+              <w:spacing w:after="0" w:before="0"/>
+              <w:jc w:val="left"/>
+            </w:pPr>
+            <w:r>
+              <w:rPr>
+                <w:sz w:val="18"/>
+                <w:szCs w:val="18"/>
+              </w:rPr>
               <w:t xml:space="preserve">Large front-end components slow down change</w:t>
             </w:r>
           </w:p>
@@ -20859,7 +22526,6 @@
               <w:bottom w:val="single" w:color="B7C3D3" w:sz="4"/>
               <w:right w:val="single" w:color="B7C3D3" w:sz="4"/>
             </w:tcBorders>
-            <w:shd w:fill="F3F6FA" w:color="auto" w:val="clear"/>
             <w:tcMar>
               <w:top w:type="dxa" w:w="60"/>
               <w:left w:type="dxa" w:w="100"/>
@@ -20883,14 +22549,13 @@
         </w:tc>
         <w:tc>
           <w:tcPr>
-            <w:tcW w:type="dxa" w:w="5115"/>
-            <w:tcBorders>
-              <w:top w:val="single" w:color="B7C3D3" w:sz="4"/>
-              <w:left w:val="single" w:color="B7C3D3" w:sz="4"/>
-              <w:bottom w:val="single" w:color="B7C3D3" w:sz="4"/>
-              <w:right w:val="single" w:color="B7C3D3" w:sz="4"/>
-            </w:tcBorders>
-            <w:shd w:fill="F3F6FA" w:color="auto" w:val="clear"/>
+            <w:tcW w:type="dxa" w:w="5160"/>
+            <w:tcBorders>
+              <w:top w:val="single" w:color="B7C3D3" w:sz="4"/>
+              <w:left w:val="single" w:color="B7C3D3" w:sz="4"/>
+              <w:bottom w:val="single" w:color="B7C3D3" w:sz="4"/>
+              <w:right w:val="single" w:color="B7C3D3" w:sz="4"/>
+            </w:tcBorders>
             <w:tcMar>
               <w:top w:type="dxa" w:w="60"/>
               <w:left w:type="dxa" w:w="100"/>

</xml_diff>